<commit_message>
Chore (doc): Fixed some syntatic errors
</commit_message>
<xml_diff>
--- a/thesis.docx
+++ b/thesis.docx
@@ -4093,7 +4093,6 @@
           <w:bCs/>
           <w:i/>
           <w:iCs/>
-          <w:color w:val="4F81BD"/>
           <w:kern w:val="0"/>
           <w14:ligatures w14:val="none"/>
         </w:rPr>
@@ -4105,7 +4104,6 @@
           <w:bCs/>
           <w:i/>
           <w:iCs/>
-          <w:color w:val="4F81BD"/>
           <w:kern w:val="0"/>
           <w14:ligatures w14:val="none"/>
         </w:rPr>
@@ -4118,7 +4116,6 @@
           <w:bCs/>
           <w:i/>
           <w:iCs/>
-          <w:color w:val="4F81BD"/>
           <w:kern w:val="0"/>
           <w14:ligatures w14:val="none"/>
         </w:rPr>
@@ -4131,7 +4128,6 @@
           <w:bCs/>
           <w:i/>
           <w:iCs/>
-          <w:color w:val="4F81BD"/>
           <w:kern w:val="0"/>
           <w14:ligatures w14:val="none"/>
         </w:rPr>
@@ -4144,7 +4140,6 @@
           <w:bCs/>
           <w:i/>
           <w:iCs/>
-          <w:color w:val="4F81BD"/>
           <w:kern w:val="0"/>
           <w14:ligatures w14:val="none"/>
         </w:rPr>
@@ -4158,7 +4153,6 @@
           <w:i/>
           <w:iCs/>
           <w:noProof/>
-          <w:color w:val="4F81BD"/>
           <w:kern w:val="0"/>
           <w14:ligatures w14:val="none"/>
         </w:rPr>
@@ -4171,7 +4165,6 @@
           <w:bCs/>
           <w:i/>
           <w:iCs/>
-          <w:color w:val="4F81BD"/>
           <w:kern w:val="0"/>
           <w14:ligatures w14:val="none"/>
         </w:rPr>
@@ -4184,7 +4177,6 @@
           <w:bCs/>
           <w:i/>
           <w:iCs/>
-          <w:color w:val="4F81BD"/>
           <w:kern w:val="0"/>
           <w14:ligatures w14:val="none"/>
         </w:rPr>
@@ -4195,7 +4187,14 @@
       <w:tblPr>
         <w:tblStyle w:val="TableGrid1"/>
         <w:tblW w:w="0" w:type="auto"/>
-        <w:jc w:val="center"/>
+        <w:tblBorders>
+          <w:top w:val="none" w:sz="0" w:space="0" w:color="auto"/>
+          <w:left w:val="none" w:sz="0" w:space="0" w:color="auto"/>
+          <w:bottom w:val="none" w:sz="0" w:space="0" w:color="auto"/>
+          <w:right w:val="none" w:sz="0" w:space="0" w:color="auto"/>
+          <w:insideH w:val="none" w:sz="0" w:space="0" w:color="auto"/>
+          <w:insideV w:val="none" w:sz="0" w:space="0" w:color="auto"/>
+        </w:tblBorders>
         <w:tblLook w:val="04A0" w:firstRow="1" w:lastRow="0" w:firstColumn="1" w:lastColumn="0" w:noHBand="0" w:noVBand="1"/>
       </w:tblPr>
       <w:tblGrid>
@@ -4207,12 +4206,13 @@
         <w:gridCol w:w="2136"/>
       </w:tblGrid>
       <w:tr>
-        <w:trPr>
-          <w:jc w:val="center"/>
-        </w:trPr>
         <w:tc>
           <w:tcPr>
             <w:tcW w:w="1589" w:type="dxa"/>
+            <w:tcBorders>
+              <w:top w:val="single" w:sz="4" w:space="0" w:color="auto"/>
+              <w:bottom w:val="single" w:sz="4" w:space="0" w:color="auto"/>
+            </w:tcBorders>
             <w:shd w:val="clear" w:color="auto" w:fill="D9EAF7"/>
           </w:tcPr>
           <w:p>
@@ -4238,6 +4238,10 @@
         <w:tc>
           <w:tcPr>
             <w:tcW w:w="1670" w:type="dxa"/>
+            <w:tcBorders>
+              <w:top w:val="single" w:sz="4" w:space="0" w:color="auto"/>
+              <w:bottom w:val="single" w:sz="4" w:space="0" w:color="auto"/>
+            </w:tcBorders>
             <w:shd w:val="clear" w:color="auto" w:fill="D9EAF7"/>
           </w:tcPr>
           <w:p>
@@ -4263,6 +4267,10 @@
         <w:tc>
           <w:tcPr>
             <w:tcW w:w="2443" w:type="dxa"/>
+            <w:tcBorders>
+              <w:top w:val="single" w:sz="4" w:space="0" w:color="auto"/>
+              <w:bottom w:val="single" w:sz="4" w:space="0" w:color="auto"/>
+            </w:tcBorders>
             <w:shd w:val="clear" w:color="auto" w:fill="D9EAF7"/>
           </w:tcPr>
           <w:p>
@@ -4288,6 +4296,10 @@
         <w:tc>
           <w:tcPr>
             <w:tcW w:w="2469" w:type="dxa"/>
+            <w:tcBorders>
+              <w:top w:val="single" w:sz="4" w:space="0" w:color="auto"/>
+              <w:bottom w:val="single" w:sz="4" w:space="0" w:color="auto"/>
+            </w:tcBorders>
             <w:shd w:val="clear" w:color="auto" w:fill="D9EAF7"/>
           </w:tcPr>
           <w:p>
@@ -4313,6 +4325,10 @@
         <w:tc>
           <w:tcPr>
             <w:tcW w:w="1723" w:type="dxa"/>
+            <w:tcBorders>
+              <w:top w:val="single" w:sz="4" w:space="0" w:color="auto"/>
+              <w:bottom w:val="single" w:sz="4" w:space="0" w:color="auto"/>
+            </w:tcBorders>
             <w:shd w:val="clear" w:color="auto" w:fill="D9EAF7"/>
           </w:tcPr>
           <w:p>
@@ -4338,6 +4354,10 @@
         <w:tc>
           <w:tcPr>
             <w:tcW w:w="2136" w:type="dxa"/>
+            <w:tcBorders>
+              <w:top w:val="single" w:sz="4" w:space="0" w:color="auto"/>
+              <w:bottom w:val="single" w:sz="4" w:space="0" w:color="auto"/>
+            </w:tcBorders>
             <w:shd w:val="clear" w:color="auto" w:fill="D9EAF7"/>
           </w:tcPr>
           <w:p>
@@ -4362,17 +4382,16 @@
         </w:tc>
       </w:tr>
       <w:tr>
-        <w:trPr>
-          <w:jc w:val="center"/>
-        </w:trPr>
         <w:tc>
           <w:tcPr>
             <w:tcW w:w="1589" w:type="dxa"/>
+            <w:tcBorders>
+              <w:top w:val="single" w:sz="4" w:space="0" w:color="auto"/>
+            </w:tcBorders>
           </w:tcPr>
           <w:p>
             <w:pPr>
               <w:spacing w:after="200" w:line="360" w:lineRule="auto"/>
-              <w:jc w:val="both"/>
               <w:rPr>
                 <w:rFonts w:ascii="Times New Roman" w:hAnsi="Times New Roman" w:cs="Times New Roman"/>
               </w:rPr>
@@ -4388,11 +4407,13 @@
         <w:tc>
           <w:tcPr>
             <w:tcW w:w="1670" w:type="dxa"/>
+            <w:tcBorders>
+              <w:top w:val="single" w:sz="4" w:space="0" w:color="auto"/>
+            </w:tcBorders>
           </w:tcPr>
           <w:p>
             <w:pPr>
               <w:spacing w:after="200" w:line="360" w:lineRule="auto"/>
-              <w:jc w:val="both"/>
               <w:rPr>
                 <w:rFonts w:ascii="Times New Roman" w:hAnsi="Times New Roman" w:cs="Times New Roman"/>
               </w:rPr>
@@ -4408,11 +4429,13 @@
         <w:tc>
           <w:tcPr>
             <w:tcW w:w="2443" w:type="dxa"/>
+            <w:tcBorders>
+              <w:top w:val="single" w:sz="4" w:space="0" w:color="auto"/>
+            </w:tcBorders>
           </w:tcPr>
           <w:p>
             <w:pPr>
               <w:spacing w:after="200" w:line="360" w:lineRule="auto"/>
-              <w:jc w:val="both"/>
               <w:rPr>
                 <w:rFonts w:ascii="Times New Roman" w:hAnsi="Times New Roman" w:cs="Times New Roman"/>
               </w:rPr>
@@ -4428,11 +4451,13 @@
         <w:tc>
           <w:tcPr>
             <w:tcW w:w="2469" w:type="dxa"/>
+            <w:tcBorders>
+              <w:top w:val="single" w:sz="4" w:space="0" w:color="auto"/>
+            </w:tcBorders>
           </w:tcPr>
           <w:p>
             <w:pPr>
               <w:spacing w:after="200" w:line="360" w:lineRule="auto"/>
-              <w:jc w:val="both"/>
               <w:rPr>
                 <w:rFonts w:ascii="Times New Roman" w:hAnsi="Times New Roman" w:cs="Times New Roman"/>
               </w:rPr>
@@ -4448,11 +4473,13 @@
         <w:tc>
           <w:tcPr>
             <w:tcW w:w="1723" w:type="dxa"/>
+            <w:tcBorders>
+              <w:top w:val="single" w:sz="4" w:space="0" w:color="auto"/>
+            </w:tcBorders>
           </w:tcPr>
           <w:p>
             <w:pPr>
               <w:spacing w:after="200" w:line="360" w:lineRule="auto"/>
-              <w:jc w:val="both"/>
               <w:rPr>
                 <w:rFonts w:ascii="Times New Roman" w:hAnsi="Times New Roman" w:cs="Times New Roman"/>
               </w:rPr>
@@ -4468,11 +4495,13 @@
         <w:tc>
           <w:tcPr>
             <w:tcW w:w="2136" w:type="dxa"/>
+            <w:tcBorders>
+              <w:top w:val="single" w:sz="4" w:space="0" w:color="auto"/>
+            </w:tcBorders>
           </w:tcPr>
           <w:p>
             <w:pPr>
               <w:spacing w:after="200" w:line="360" w:lineRule="auto"/>
-              <w:jc w:val="both"/>
               <w:rPr>
                 <w:rFonts w:ascii="Times New Roman" w:hAnsi="Times New Roman" w:cs="Times New Roman"/>
               </w:rPr>
@@ -4487,9 +4516,6 @@
         </w:tc>
       </w:tr>
       <w:tr>
-        <w:trPr>
-          <w:jc w:val="center"/>
-        </w:trPr>
         <w:tc>
           <w:tcPr>
             <w:tcW w:w="1589" w:type="dxa"/>
@@ -4497,7 +4523,6 @@
           <w:p>
             <w:pPr>
               <w:spacing w:after="200" w:line="360" w:lineRule="auto"/>
-              <w:jc w:val="both"/>
               <w:rPr>
                 <w:rFonts w:ascii="Times New Roman" w:hAnsi="Times New Roman" w:cs="Times New Roman"/>
               </w:rPr>
@@ -4517,7 +4542,6 @@
           <w:p>
             <w:pPr>
               <w:spacing w:after="200" w:line="360" w:lineRule="auto"/>
-              <w:jc w:val="both"/>
               <w:rPr>
                 <w:rFonts w:ascii="Times New Roman" w:hAnsi="Times New Roman" w:cs="Times New Roman"/>
               </w:rPr>
@@ -4537,7 +4561,6 @@
           <w:p>
             <w:pPr>
               <w:spacing w:after="200" w:line="360" w:lineRule="auto"/>
-              <w:jc w:val="both"/>
               <w:rPr>
                 <w:rFonts w:ascii="Times New Roman" w:hAnsi="Times New Roman" w:cs="Times New Roman"/>
               </w:rPr>
@@ -4557,7 +4580,6 @@
           <w:p>
             <w:pPr>
               <w:spacing w:after="200" w:line="360" w:lineRule="auto"/>
-              <w:jc w:val="both"/>
               <w:rPr>
                 <w:rFonts w:ascii="Times New Roman" w:hAnsi="Times New Roman" w:cs="Times New Roman"/>
               </w:rPr>
@@ -4577,7 +4599,6 @@
           <w:p>
             <w:pPr>
               <w:spacing w:after="200" w:line="360" w:lineRule="auto"/>
-              <w:jc w:val="both"/>
               <w:rPr>
                 <w:rFonts w:ascii="Times New Roman" w:hAnsi="Times New Roman" w:cs="Times New Roman"/>
               </w:rPr>
@@ -4597,7 +4618,6 @@
           <w:p>
             <w:pPr>
               <w:spacing w:after="200" w:line="360" w:lineRule="auto"/>
-              <w:jc w:val="both"/>
               <w:rPr>
                 <w:rFonts w:ascii="Times New Roman" w:hAnsi="Times New Roman" w:cs="Times New Roman"/>
               </w:rPr>
@@ -4612,9 +4632,6 @@
         </w:tc>
       </w:tr>
       <w:tr>
-        <w:trPr>
-          <w:jc w:val="center"/>
-        </w:trPr>
         <w:tc>
           <w:tcPr>
             <w:tcW w:w="1589" w:type="dxa"/>
@@ -4622,7 +4639,6 @@
           <w:p>
             <w:pPr>
               <w:spacing w:after="200" w:line="360" w:lineRule="auto"/>
-              <w:jc w:val="both"/>
               <w:rPr>
                 <w:rFonts w:ascii="Times New Roman" w:hAnsi="Times New Roman" w:cs="Times New Roman"/>
               </w:rPr>
@@ -4642,7 +4658,6 @@
           <w:p>
             <w:pPr>
               <w:spacing w:after="200" w:line="360" w:lineRule="auto"/>
-              <w:jc w:val="both"/>
               <w:rPr>
                 <w:rFonts w:ascii="Times New Roman" w:hAnsi="Times New Roman" w:cs="Times New Roman"/>
               </w:rPr>
@@ -4662,7 +4677,6 @@
           <w:p>
             <w:pPr>
               <w:spacing w:after="200" w:line="360" w:lineRule="auto"/>
-              <w:jc w:val="both"/>
               <w:rPr>
                 <w:rFonts w:ascii="Times New Roman" w:hAnsi="Times New Roman" w:cs="Times New Roman"/>
               </w:rPr>
@@ -4682,7 +4696,6 @@
           <w:p>
             <w:pPr>
               <w:spacing w:after="200" w:line="360" w:lineRule="auto"/>
-              <w:jc w:val="both"/>
               <w:rPr>
                 <w:rFonts w:ascii="Times New Roman" w:hAnsi="Times New Roman" w:cs="Times New Roman"/>
               </w:rPr>
@@ -4702,7 +4715,6 @@
           <w:p>
             <w:pPr>
               <w:spacing w:after="200" w:line="360" w:lineRule="auto"/>
-              <w:jc w:val="both"/>
               <w:rPr>
                 <w:rFonts w:ascii="Times New Roman" w:hAnsi="Times New Roman" w:cs="Times New Roman"/>
               </w:rPr>
@@ -4722,7 +4734,6 @@
           <w:p>
             <w:pPr>
               <w:spacing w:after="200" w:line="360" w:lineRule="auto"/>
-              <w:jc w:val="both"/>
               <w:rPr>
                 <w:rFonts w:ascii="Times New Roman" w:hAnsi="Times New Roman" w:cs="Times New Roman"/>
               </w:rPr>
@@ -4737,9 +4748,6 @@
         </w:tc>
       </w:tr>
       <w:tr>
-        <w:trPr>
-          <w:jc w:val="center"/>
-        </w:trPr>
         <w:tc>
           <w:tcPr>
             <w:tcW w:w="1589" w:type="dxa"/>
@@ -4747,7 +4755,6 @@
           <w:p>
             <w:pPr>
               <w:spacing w:after="200" w:line="360" w:lineRule="auto"/>
-              <w:jc w:val="both"/>
               <w:rPr>
                 <w:rFonts w:ascii="Times New Roman" w:hAnsi="Times New Roman" w:cs="Times New Roman"/>
               </w:rPr>
@@ -4768,7 +4775,6 @@
           <w:p>
             <w:pPr>
               <w:spacing w:after="200" w:line="360" w:lineRule="auto"/>
-              <w:jc w:val="both"/>
               <w:rPr>
                 <w:rFonts w:ascii="Times New Roman" w:hAnsi="Times New Roman" w:cs="Times New Roman"/>
               </w:rPr>
@@ -4788,7 +4794,6 @@
           <w:p>
             <w:pPr>
               <w:spacing w:after="200" w:line="360" w:lineRule="auto"/>
-              <w:jc w:val="both"/>
               <w:rPr>
                 <w:rFonts w:ascii="Times New Roman" w:hAnsi="Times New Roman" w:cs="Times New Roman"/>
               </w:rPr>
@@ -4808,7 +4813,6 @@
           <w:p>
             <w:pPr>
               <w:spacing w:after="200" w:line="360" w:lineRule="auto"/>
-              <w:jc w:val="both"/>
               <w:rPr>
                 <w:rFonts w:ascii="Times New Roman" w:hAnsi="Times New Roman" w:cs="Times New Roman"/>
               </w:rPr>
@@ -4828,7 +4832,6 @@
           <w:p>
             <w:pPr>
               <w:spacing w:after="200" w:line="360" w:lineRule="auto"/>
-              <w:jc w:val="both"/>
               <w:rPr>
                 <w:rFonts w:ascii="Times New Roman" w:hAnsi="Times New Roman" w:cs="Times New Roman"/>
               </w:rPr>
@@ -4848,7 +4851,6 @@
           <w:p>
             <w:pPr>
               <w:spacing w:after="200" w:line="360" w:lineRule="auto"/>
-              <w:jc w:val="both"/>
               <w:rPr>
                 <w:rFonts w:ascii="Times New Roman" w:hAnsi="Times New Roman" w:cs="Times New Roman"/>
               </w:rPr>
@@ -4863,9 +4865,6 @@
         </w:tc>
       </w:tr>
       <w:tr>
-        <w:trPr>
-          <w:jc w:val="center"/>
-        </w:trPr>
         <w:tc>
           <w:tcPr>
             <w:tcW w:w="1589" w:type="dxa"/>
@@ -4873,7 +4872,6 @@
           <w:p>
             <w:pPr>
               <w:spacing w:after="200" w:line="360" w:lineRule="auto"/>
-              <w:jc w:val="both"/>
               <w:rPr>
                 <w:rFonts w:ascii="Times New Roman" w:hAnsi="Times New Roman" w:cs="Times New Roman"/>
               </w:rPr>
@@ -4893,7 +4891,6 @@
           <w:p>
             <w:pPr>
               <w:spacing w:after="200" w:line="360" w:lineRule="auto"/>
-              <w:jc w:val="both"/>
               <w:rPr>
                 <w:rFonts w:ascii="Times New Roman" w:hAnsi="Times New Roman" w:cs="Times New Roman"/>
               </w:rPr>
@@ -4913,7 +4910,6 @@
           <w:p>
             <w:pPr>
               <w:spacing w:after="200" w:line="360" w:lineRule="auto"/>
-              <w:jc w:val="both"/>
               <w:rPr>
                 <w:rFonts w:ascii="Times New Roman" w:hAnsi="Times New Roman" w:cs="Times New Roman"/>
               </w:rPr>
@@ -4933,7 +4929,6 @@
           <w:p>
             <w:pPr>
               <w:spacing w:after="200" w:line="360" w:lineRule="auto"/>
-              <w:jc w:val="both"/>
               <w:rPr>
                 <w:rFonts w:ascii="Times New Roman" w:hAnsi="Times New Roman" w:cs="Times New Roman"/>
               </w:rPr>
@@ -4953,7 +4948,6 @@
           <w:p>
             <w:pPr>
               <w:spacing w:after="200" w:line="360" w:lineRule="auto"/>
-              <w:jc w:val="both"/>
               <w:rPr>
                 <w:rFonts w:ascii="Times New Roman" w:hAnsi="Times New Roman" w:cs="Times New Roman"/>
               </w:rPr>
@@ -4973,7 +4967,6 @@
           <w:p>
             <w:pPr>
               <w:spacing w:after="200" w:line="360" w:lineRule="auto"/>
-              <w:jc w:val="both"/>
               <w:rPr>
                 <w:rFonts w:ascii="Times New Roman" w:hAnsi="Times New Roman" w:cs="Times New Roman"/>
               </w:rPr>
@@ -4988,9 +4981,6 @@
         </w:tc>
       </w:tr>
       <w:tr>
-        <w:trPr>
-          <w:jc w:val="center"/>
-        </w:trPr>
         <w:tc>
           <w:tcPr>
             <w:tcW w:w="1589" w:type="dxa"/>
@@ -4998,7 +4988,6 @@
           <w:p>
             <w:pPr>
               <w:spacing w:after="200" w:line="360" w:lineRule="auto"/>
-              <w:jc w:val="both"/>
               <w:rPr>
                 <w:rFonts w:ascii="Times New Roman" w:hAnsi="Times New Roman" w:cs="Times New Roman"/>
               </w:rPr>
@@ -5018,7 +5007,6 @@
           <w:p>
             <w:pPr>
               <w:spacing w:after="200" w:line="360" w:lineRule="auto"/>
-              <w:jc w:val="both"/>
               <w:rPr>
                 <w:rFonts w:ascii="Times New Roman" w:hAnsi="Times New Roman" w:cs="Times New Roman"/>
               </w:rPr>
@@ -5038,7 +5026,6 @@
           <w:p>
             <w:pPr>
               <w:spacing w:after="200" w:line="360" w:lineRule="auto"/>
-              <w:jc w:val="both"/>
               <w:rPr>
                 <w:rFonts w:ascii="Times New Roman" w:hAnsi="Times New Roman" w:cs="Times New Roman"/>
               </w:rPr>
@@ -5058,7 +5045,6 @@
           <w:p>
             <w:pPr>
               <w:spacing w:after="200" w:line="360" w:lineRule="auto"/>
-              <w:jc w:val="both"/>
               <w:rPr>
                 <w:rFonts w:ascii="Times New Roman" w:hAnsi="Times New Roman" w:cs="Times New Roman"/>
               </w:rPr>
@@ -5078,7 +5064,6 @@
           <w:p>
             <w:pPr>
               <w:spacing w:after="200" w:line="360" w:lineRule="auto"/>
-              <w:jc w:val="both"/>
               <w:rPr>
                 <w:rFonts w:ascii="Times New Roman" w:hAnsi="Times New Roman" w:cs="Times New Roman"/>
               </w:rPr>
@@ -5098,7 +5083,6 @@
           <w:p>
             <w:pPr>
               <w:spacing w:after="200" w:line="360" w:lineRule="auto"/>
-              <w:jc w:val="both"/>
               <w:rPr>
                 <w:rFonts w:ascii="Times New Roman" w:hAnsi="Times New Roman" w:cs="Times New Roman"/>
               </w:rPr>
@@ -5113,9 +5097,6 @@
         </w:tc>
       </w:tr>
       <w:tr>
-        <w:trPr>
-          <w:jc w:val="center"/>
-        </w:trPr>
         <w:tc>
           <w:tcPr>
             <w:tcW w:w="1589" w:type="dxa"/>
@@ -5123,7 +5104,6 @@
           <w:p>
             <w:pPr>
               <w:spacing w:after="200" w:line="360" w:lineRule="auto"/>
-              <w:jc w:val="both"/>
               <w:rPr>
                 <w:rFonts w:ascii="Times New Roman" w:hAnsi="Times New Roman" w:cs="Times New Roman"/>
               </w:rPr>
@@ -5143,7 +5123,6 @@
           <w:p>
             <w:pPr>
               <w:spacing w:after="200" w:line="360" w:lineRule="auto"/>
-              <w:jc w:val="both"/>
               <w:rPr>
                 <w:rFonts w:ascii="Times New Roman" w:hAnsi="Times New Roman" w:cs="Times New Roman"/>
               </w:rPr>
@@ -5163,7 +5142,6 @@
           <w:p>
             <w:pPr>
               <w:spacing w:after="200" w:line="360" w:lineRule="auto"/>
-              <w:jc w:val="both"/>
               <w:rPr>
                 <w:rFonts w:ascii="Times New Roman" w:hAnsi="Times New Roman" w:cs="Times New Roman"/>
               </w:rPr>
@@ -5183,7 +5161,6 @@
           <w:p>
             <w:pPr>
               <w:spacing w:after="200" w:line="360" w:lineRule="auto"/>
-              <w:jc w:val="both"/>
               <w:rPr>
                 <w:rFonts w:ascii="Times New Roman" w:hAnsi="Times New Roman" w:cs="Times New Roman"/>
               </w:rPr>
@@ -5203,7 +5180,6 @@
           <w:p>
             <w:pPr>
               <w:spacing w:after="200" w:line="360" w:lineRule="auto"/>
-              <w:jc w:val="both"/>
               <w:rPr>
                 <w:rFonts w:ascii="Times New Roman" w:hAnsi="Times New Roman" w:cs="Times New Roman"/>
               </w:rPr>
@@ -5223,7 +5199,6 @@
           <w:p>
             <w:pPr>
               <w:spacing w:after="200" w:line="360" w:lineRule="auto"/>
-              <w:jc w:val="both"/>
               <w:rPr>
                 <w:rFonts w:ascii="Times New Roman" w:hAnsi="Times New Roman" w:cs="Times New Roman"/>
               </w:rPr>
@@ -5238,9 +5213,6 @@
         </w:tc>
       </w:tr>
       <w:tr>
-        <w:trPr>
-          <w:jc w:val="center"/>
-        </w:trPr>
         <w:tc>
           <w:tcPr>
             <w:tcW w:w="1589" w:type="dxa"/>
@@ -5248,7 +5220,6 @@
           <w:p>
             <w:pPr>
               <w:spacing w:after="200" w:line="360" w:lineRule="auto"/>
-              <w:jc w:val="both"/>
               <w:rPr>
                 <w:rFonts w:ascii="Times New Roman" w:hAnsi="Times New Roman" w:cs="Times New Roman"/>
               </w:rPr>
@@ -5268,7 +5239,6 @@
           <w:p>
             <w:pPr>
               <w:spacing w:after="200" w:line="360" w:lineRule="auto"/>
-              <w:jc w:val="both"/>
               <w:rPr>
                 <w:rFonts w:ascii="Times New Roman" w:hAnsi="Times New Roman" w:cs="Times New Roman"/>
               </w:rPr>
@@ -5288,7 +5258,6 @@
           <w:p>
             <w:pPr>
               <w:spacing w:after="200" w:line="360" w:lineRule="auto"/>
-              <w:jc w:val="both"/>
               <w:rPr>
                 <w:rFonts w:ascii="Times New Roman" w:hAnsi="Times New Roman" w:cs="Times New Roman"/>
               </w:rPr>
@@ -5308,7 +5277,6 @@
           <w:p>
             <w:pPr>
               <w:spacing w:after="200" w:line="360" w:lineRule="auto"/>
-              <w:jc w:val="both"/>
               <w:rPr>
                 <w:rFonts w:ascii="Times New Roman" w:hAnsi="Times New Roman" w:cs="Times New Roman"/>
               </w:rPr>
@@ -5328,7 +5296,6 @@
           <w:p>
             <w:pPr>
               <w:spacing w:after="200" w:line="360" w:lineRule="auto"/>
-              <w:jc w:val="both"/>
               <w:rPr>
                 <w:rFonts w:ascii="Times New Roman" w:hAnsi="Times New Roman" w:cs="Times New Roman"/>
               </w:rPr>
@@ -5348,7 +5315,6 @@
           <w:p>
             <w:pPr>
               <w:spacing w:after="200" w:line="360" w:lineRule="auto"/>
-              <w:jc w:val="both"/>
               <w:rPr>
                 <w:rFonts w:ascii="Times New Roman" w:hAnsi="Times New Roman" w:cs="Times New Roman"/>
               </w:rPr>
@@ -5363,9 +5329,6 @@
         </w:tc>
       </w:tr>
       <w:tr>
-        <w:trPr>
-          <w:jc w:val="center"/>
-        </w:trPr>
         <w:tc>
           <w:tcPr>
             <w:tcW w:w="1589" w:type="dxa"/>
@@ -5373,7 +5336,6 @@
           <w:p>
             <w:pPr>
               <w:spacing w:after="200" w:line="360" w:lineRule="auto"/>
-              <w:jc w:val="both"/>
               <w:rPr>
                 <w:rFonts w:ascii="Times New Roman" w:hAnsi="Times New Roman" w:cs="Times New Roman"/>
               </w:rPr>
@@ -5394,7 +5356,6 @@
           <w:p>
             <w:pPr>
               <w:spacing w:after="200" w:line="360" w:lineRule="auto"/>
-              <w:jc w:val="both"/>
               <w:rPr>
                 <w:rFonts w:ascii="Times New Roman" w:hAnsi="Times New Roman" w:cs="Times New Roman"/>
               </w:rPr>
@@ -5414,7 +5375,6 @@
           <w:p>
             <w:pPr>
               <w:spacing w:after="200" w:line="360" w:lineRule="auto"/>
-              <w:jc w:val="both"/>
               <w:rPr>
                 <w:rFonts w:ascii="Times New Roman" w:hAnsi="Times New Roman" w:cs="Times New Roman"/>
               </w:rPr>
@@ -5434,7 +5394,6 @@
           <w:p>
             <w:pPr>
               <w:spacing w:after="200" w:line="360" w:lineRule="auto"/>
-              <w:jc w:val="both"/>
               <w:rPr>
                 <w:rFonts w:ascii="Times New Roman" w:hAnsi="Times New Roman" w:cs="Times New Roman"/>
               </w:rPr>
@@ -5454,7 +5413,6 @@
           <w:p>
             <w:pPr>
               <w:spacing w:after="200" w:line="360" w:lineRule="auto"/>
-              <w:jc w:val="both"/>
               <w:rPr>
                 <w:rFonts w:ascii="Times New Roman" w:hAnsi="Times New Roman" w:cs="Times New Roman"/>
               </w:rPr>
@@ -5474,7 +5432,6 @@
           <w:p>
             <w:pPr>
               <w:spacing w:after="200" w:line="360" w:lineRule="auto"/>
-              <w:jc w:val="both"/>
               <w:rPr>
                 <w:rFonts w:ascii="Times New Roman" w:hAnsi="Times New Roman" w:cs="Times New Roman"/>
               </w:rPr>
@@ -5489,9 +5446,6 @@
         </w:tc>
       </w:tr>
       <w:tr>
-        <w:trPr>
-          <w:jc w:val="center"/>
-        </w:trPr>
         <w:tc>
           <w:tcPr>
             <w:tcW w:w="1589" w:type="dxa"/>
@@ -5499,7 +5453,6 @@
           <w:p>
             <w:pPr>
               <w:spacing w:after="200" w:line="360" w:lineRule="auto"/>
-              <w:jc w:val="both"/>
               <w:rPr>
                 <w:rFonts w:ascii="Times New Roman" w:hAnsi="Times New Roman" w:cs="Times New Roman"/>
               </w:rPr>
@@ -5519,7 +5472,6 @@
           <w:p>
             <w:pPr>
               <w:spacing w:after="200" w:line="360" w:lineRule="auto"/>
-              <w:jc w:val="both"/>
               <w:rPr>
                 <w:rFonts w:ascii="Times New Roman" w:hAnsi="Times New Roman" w:cs="Times New Roman"/>
               </w:rPr>
@@ -5539,7 +5491,6 @@
           <w:p>
             <w:pPr>
               <w:spacing w:after="200" w:line="360" w:lineRule="auto"/>
-              <w:jc w:val="both"/>
               <w:rPr>
                 <w:rFonts w:ascii="Times New Roman" w:hAnsi="Times New Roman" w:cs="Times New Roman"/>
               </w:rPr>
@@ -5559,7 +5510,6 @@
           <w:p>
             <w:pPr>
               <w:spacing w:after="200" w:line="360" w:lineRule="auto"/>
-              <w:jc w:val="both"/>
               <w:rPr>
                 <w:rFonts w:ascii="Times New Roman" w:hAnsi="Times New Roman" w:cs="Times New Roman"/>
               </w:rPr>
@@ -5579,7 +5529,6 @@
           <w:p>
             <w:pPr>
               <w:spacing w:after="200" w:line="360" w:lineRule="auto"/>
-              <w:jc w:val="both"/>
               <w:rPr>
                 <w:rFonts w:ascii="Times New Roman" w:hAnsi="Times New Roman" w:cs="Times New Roman"/>
               </w:rPr>
@@ -5599,7 +5548,6 @@
           <w:p>
             <w:pPr>
               <w:spacing w:after="200" w:line="360" w:lineRule="auto"/>
-              <w:jc w:val="both"/>
               <w:rPr>
                 <w:rFonts w:ascii="Times New Roman" w:hAnsi="Times New Roman" w:cs="Times New Roman"/>
               </w:rPr>
@@ -5614,17 +5562,16 @@
         </w:tc>
       </w:tr>
       <w:tr>
-        <w:trPr>
-          <w:jc w:val="center"/>
-        </w:trPr>
         <w:tc>
           <w:tcPr>
             <w:tcW w:w="1589" w:type="dxa"/>
+            <w:tcBorders>
+              <w:bottom w:val="single" w:sz="4" w:space="0" w:color="auto"/>
+            </w:tcBorders>
           </w:tcPr>
           <w:p>
             <w:pPr>
               <w:spacing w:after="200" w:line="360" w:lineRule="auto"/>
-              <w:jc w:val="both"/>
               <w:rPr>
                 <w:rFonts w:ascii="Times New Roman" w:hAnsi="Times New Roman" w:cs="Times New Roman"/>
               </w:rPr>
@@ -5640,11 +5587,13 @@
         <w:tc>
           <w:tcPr>
             <w:tcW w:w="1670" w:type="dxa"/>
+            <w:tcBorders>
+              <w:bottom w:val="single" w:sz="4" w:space="0" w:color="auto"/>
+            </w:tcBorders>
           </w:tcPr>
           <w:p>
             <w:pPr>
               <w:spacing w:after="200" w:line="360" w:lineRule="auto"/>
-              <w:jc w:val="both"/>
               <w:rPr>
                 <w:rFonts w:ascii="Times New Roman" w:hAnsi="Times New Roman" w:cs="Times New Roman"/>
               </w:rPr>
@@ -5660,11 +5609,13 @@
         <w:tc>
           <w:tcPr>
             <w:tcW w:w="2443" w:type="dxa"/>
+            <w:tcBorders>
+              <w:bottom w:val="single" w:sz="4" w:space="0" w:color="auto"/>
+            </w:tcBorders>
           </w:tcPr>
           <w:p>
             <w:pPr>
               <w:spacing w:after="200" w:line="360" w:lineRule="auto"/>
-              <w:jc w:val="both"/>
               <w:rPr>
                 <w:rFonts w:ascii="Times New Roman" w:hAnsi="Times New Roman" w:cs="Times New Roman"/>
               </w:rPr>
@@ -5680,11 +5631,13 @@
         <w:tc>
           <w:tcPr>
             <w:tcW w:w="2469" w:type="dxa"/>
+            <w:tcBorders>
+              <w:bottom w:val="single" w:sz="4" w:space="0" w:color="auto"/>
+            </w:tcBorders>
           </w:tcPr>
           <w:p>
             <w:pPr>
               <w:spacing w:after="200" w:line="360" w:lineRule="auto"/>
-              <w:jc w:val="both"/>
               <w:rPr>
                 <w:rFonts w:ascii="Times New Roman" w:hAnsi="Times New Roman" w:cs="Times New Roman"/>
               </w:rPr>
@@ -5700,11 +5653,13 @@
         <w:tc>
           <w:tcPr>
             <w:tcW w:w="1723" w:type="dxa"/>
+            <w:tcBorders>
+              <w:bottom w:val="single" w:sz="4" w:space="0" w:color="auto"/>
+            </w:tcBorders>
           </w:tcPr>
           <w:p>
             <w:pPr>
               <w:spacing w:after="200" w:line="360" w:lineRule="auto"/>
-              <w:jc w:val="both"/>
               <w:rPr>
                 <w:rFonts w:ascii="Times New Roman" w:hAnsi="Times New Roman" w:cs="Times New Roman"/>
               </w:rPr>
@@ -5720,11 +5675,13 @@
         <w:tc>
           <w:tcPr>
             <w:tcW w:w="2136" w:type="dxa"/>
+            <w:tcBorders>
+              <w:bottom w:val="single" w:sz="4" w:space="0" w:color="auto"/>
+            </w:tcBorders>
           </w:tcPr>
           <w:p>
             <w:pPr>
               <w:spacing w:after="200" w:line="360" w:lineRule="auto"/>
-              <w:jc w:val="both"/>
               <w:rPr>
                 <w:rFonts w:ascii="Times New Roman" w:hAnsi="Times New Roman" w:cs="Times New Roman"/>
               </w:rPr>
@@ -5741,6 +5698,9 @@
     </w:tbl>
     <w:p>
       <w:pPr>
+        <w:tabs>
+          <w:tab w:val="left" w:pos="2830"/>
+        </w:tabs>
         <w:spacing w:after="200" w:line="360" w:lineRule="auto"/>
         <w:jc w:val="both"/>
         <w:rPr>
@@ -5748,6 +5708,35 @@
           <w:kern w:val="0"/>
           <w:szCs w:val="22"/>
           <w14:ligatures w14:val="none"/>
+        </w:rPr>
+      </w:pPr>
+      <w:r>
+        <w:rPr>
+          <w:rFonts w:ascii="Times New Roman" w:eastAsia="MS Mincho" w:hAnsi="Times New Roman" w:cs="Times New Roman"/>
+          <w:kern w:val="0"/>
+          <w:szCs w:val="22"/>
+          <w14:ligatures w14:val="none"/>
+        </w:rPr>
+        <w:t>Source: field survey</w:t>
+      </w:r>
+      <w:r>
+        <w:rPr>
+          <w:rFonts w:ascii="Times New Roman" w:eastAsia="MS Mincho" w:hAnsi="Times New Roman" w:cs="Times New Roman"/>
+          <w:kern w:val="0"/>
+          <w:szCs w:val="22"/>
+          <w14:ligatures w14:val="none"/>
+        </w:rPr>
+        <w:t xml:space="preserve"> (2026)</w:t>
+      </w:r>
+    </w:p>
+    <w:p>
+      <w:pPr>
+        <w:tabs>
+          <w:tab w:val="left" w:pos="2830"/>
+        </w:tabs>
+        <w:rPr>
+          <w:rFonts w:ascii="Times New Roman" w:eastAsia="MS Mincho" w:hAnsi="Times New Roman" w:cs="Times New Roman"/>
+          <w:szCs w:val="22"/>
         </w:rPr>
         <w:sectPr>
           <w:pgSz w:w="15840" w:h="12240" w:orient="landscape"/>
@@ -5756,6 +5745,13 @@
           <w:docGrid w:linePitch="360"/>
         </w:sectPr>
       </w:pPr>
+      <w:r>
+        <w:rPr>
+          <w:rFonts w:ascii="Times New Roman" w:eastAsia="MS Mincho" w:hAnsi="Times New Roman" w:cs="Times New Roman"/>
+          <w:szCs w:val="22"/>
+        </w:rPr>
+        <w:tab/>
+      </w:r>
     </w:p>
     <w:p>
       <w:pPr>
@@ -5948,6 +5944,90 @@
           <w14:ligatures w14:val="none"/>
         </w:rPr>
         <w:t>The conceptual framework is based on the proposition that the complexity of an attribute-based credential circuit influences the resources required to generate and verify its zero-knowledge proof. The framework distinguishes experimental factors, controlled factors, intermediate measures, and performance outcomes.</w:t>
+      </w:r>
+    </w:p>
+    <w:p>
+      <w:pPr>
+        <w:pStyle w:val="Caption"/>
+        <w:keepNext/>
+        <w:rPr>
+          <w:rFonts w:ascii="Times New Roman" w:hAnsi="Times New Roman" w:cs="Times New Roman"/>
+          <w:b/>
+          <w:bCs/>
+          <w:sz w:val="24"/>
+          <w:szCs w:val="24"/>
+        </w:rPr>
+      </w:pPr>
+      <w:r>
+        <w:rPr>
+          <w:rFonts w:ascii="Times New Roman" w:hAnsi="Times New Roman" w:cs="Times New Roman"/>
+          <w:b/>
+          <w:bCs/>
+          <w:sz w:val="24"/>
+          <w:szCs w:val="24"/>
+        </w:rPr>
+        <w:t xml:space="preserve">Table </w:t>
+      </w:r>
+      <w:r>
+        <w:rPr>
+          <w:rFonts w:ascii="Times New Roman" w:hAnsi="Times New Roman" w:cs="Times New Roman"/>
+          <w:b/>
+          <w:bCs/>
+          <w:sz w:val="24"/>
+          <w:szCs w:val="24"/>
+        </w:rPr>
+        <w:fldChar w:fldCharType="begin"/>
+      </w:r>
+      <w:r>
+        <w:rPr>
+          <w:rFonts w:ascii="Times New Roman" w:hAnsi="Times New Roman" w:cs="Times New Roman"/>
+          <w:b/>
+          <w:bCs/>
+          <w:sz w:val="24"/>
+          <w:szCs w:val="24"/>
+        </w:rPr>
+        <w:instrText xml:space="preserve"> SEQ Table \* ARABIC </w:instrText>
+      </w:r>
+      <w:r>
+        <w:rPr>
+          <w:rFonts w:ascii="Times New Roman" w:hAnsi="Times New Roman" w:cs="Times New Roman"/>
+          <w:b/>
+          <w:bCs/>
+          <w:sz w:val="24"/>
+          <w:szCs w:val="24"/>
+        </w:rPr>
+        <w:fldChar w:fldCharType="separate"/>
+      </w:r>
+      <w:r>
+        <w:rPr>
+          <w:rFonts w:ascii="Times New Roman" w:hAnsi="Times New Roman" w:cs="Times New Roman"/>
+          <w:b/>
+          <w:bCs/>
+          <w:noProof/>
+          <w:sz w:val="24"/>
+          <w:szCs w:val="24"/>
+        </w:rPr>
+        <w:t>2</w:t>
+      </w:r>
+      <w:r>
+        <w:rPr>
+          <w:rFonts w:ascii="Times New Roman" w:hAnsi="Times New Roman" w:cs="Times New Roman"/>
+          <w:b/>
+          <w:bCs/>
+          <w:sz w:val="24"/>
+          <w:szCs w:val="24"/>
+        </w:rPr>
+        <w:fldChar w:fldCharType="end"/>
+      </w:r>
+      <w:r>
+        <w:rPr>
+          <w:rFonts w:ascii="Times New Roman" w:hAnsi="Times New Roman" w:cs="Times New Roman"/>
+          <w:b/>
+          <w:bCs/>
+          <w:sz w:val="24"/>
+          <w:szCs w:val="24"/>
+        </w:rPr>
+        <w:t>: Conceptual Framework</w:t>
       </w:r>
     </w:p>
     <w:tbl>
@@ -5955,12 +6035,20 @@
         <w:tblStyle w:val="TableGrid1"/>
         <w:tblW w:w="0" w:type="auto"/>
         <w:jc w:val="center"/>
+        <w:tblBorders>
+          <w:top w:val="none" w:sz="0" w:space="0" w:color="auto"/>
+          <w:left w:val="none" w:sz="0" w:space="0" w:color="auto"/>
+          <w:bottom w:val="none" w:sz="0" w:space="0" w:color="auto"/>
+          <w:right w:val="none" w:sz="0" w:space="0" w:color="auto"/>
+          <w:insideH w:val="none" w:sz="0" w:space="0" w:color="auto"/>
+          <w:insideV w:val="none" w:sz="0" w:space="0" w:color="auto"/>
+        </w:tblBorders>
         <w:tblLook w:val="04A0" w:firstRow="1" w:lastRow="0" w:firstColumn="1" w:lastColumn="0" w:noHBand="0" w:noVBand="1"/>
       </w:tblPr>
       <w:tblGrid>
-        <w:gridCol w:w="2802"/>
-        <w:gridCol w:w="2903"/>
-        <w:gridCol w:w="2925"/>
+        <w:gridCol w:w="2806"/>
+        <w:gridCol w:w="2906"/>
+        <w:gridCol w:w="2928"/>
       </w:tblGrid>
       <w:tr>
         <w:trPr>
@@ -5969,6 +6057,10 @@
         <w:tc>
           <w:tcPr>
             <w:tcW w:w="3120" w:type="dxa"/>
+            <w:tcBorders>
+              <w:top w:val="single" w:sz="4" w:space="0" w:color="auto"/>
+              <w:bottom w:val="single" w:sz="4" w:space="0" w:color="auto"/>
+            </w:tcBorders>
             <w:shd w:val="clear" w:color="auto" w:fill="D9EAF7"/>
           </w:tcPr>
           <w:p>
@@ -5977,11 +6069,15 @@
               <w:jc w:val="both"/>
               <w:rPr>
                 <w:rFonts w:ascii="Times New Roman" w:hAnsi="Times New Roman" w:cs="Times New Roman"/>
-              </w:rPr>
-            </w:pPr>
-            <w:r>
-              <w:rPr>
-                <w:rFonts w:ascii="Times New Roman" w:hAnsi="Times New Roman" w:cs="Times New Roman"/>
+                <w:b/>
+                <w:bCs/>
+              </w:rPr>
+            </w:pPr>
+            <w:r>
+              <w:rPr>
+                <w:rFonts w:ascii="Times New Roman" w:hAnsi="Times New Roman" w:cs="Times New Roman"/>
+                <w:b/>
+                <w:bCs/>
               </w:rPr>
               <w:t>Category</w:t>
             </w:r>
@@ -5990,6 +6086,10 @@
         <w:tc>
           <w:tcPr>
             <w:tcW w:w="3120" w:type="dxa"/>
+            <w:tcBorders>
+              <w:top w:val="single" w:sz="4" w:space="0" w:color="auto"/>
+              <w:bottom w:val="single" w:sz="4" w:space="0" w:color="auto"/>
+            </w:tcBorders>
             <w:shd w:val="clear" w:color="auto" w:fill="D9EAF7"/>
           </w:tcPr>
           <w:p>
@@ -5998,11 +6098,15 @@
               <w:jc w:val="both"/>
               <w:rPr>
                 <w:rFonts w:ascii="Times New Roman" w:hAnsi="Times New Roman" w:cs="Times New Roman"/>
-              </w:rPr>
-            </w:pPr>
-            <w:r>
-              <w:rPr>
-                <w:rFonts w:ascii="Times New Roman" w:hAnsi="Times New Roman" w:cs="Times New Roman"/>
+                <w:b/>
+                <w:bCs/>
+              </w:rPr>
+            </w:pPr>
+            <w:r>
+              <w:rPr>
+                <w:rFonts w:ascii="Times New Roman" w:hAnsi="Times New Roman" w:cs="Times New Roman"/>
+                <w:b/>
+                <w:bCs/>
               </w:rPr>
               <w:t>Variable</w:t>
             </w:r>
@@ -6011,6 +6115,10 @@
         <w:tc>
           <w:tcPr>
             <w:tcW w:w="3120" w:type="dxa"/>
+            <w:tcBorders>
+              <w:top w:val="single" w:sz="4" w:space="0" w:color="auto"/>
+              <w:bottom w:val="single" w:sz="4" w:space="0" w:color="auto"/>
+            </w:tcBorders>
             <w:shd w:val="clear" w:color="auto" w:fill="D9EAF7"/>
           </w:tcPr>
           <w:p>
@@ -6019,11 +6127,15 @@
               <w:jc w:val="both"/>
               <w:rPr>
                 <w:rFonts w:ascii="Times New Roman" w:hAnsi="Times New Roman" w:cs="Times New Roman"/>
-              </w:rPr>
-            </w:pPr>
-            <w:r>
-              <w:rPr>
-                <w:rFonts w:ascii="Times New Roman" w:hAnsi="Times New Roman" w:cs="Times New Roman"/>
+                <w:b/>
+                <w:bCs/>
+              </w:rPr>
+            </w:pPr>
+            <w:r>
+              <w:rPr>
+                <w:rFonts w:ascii="Times New Roman" w:hAnsi="Times New Roman" w:cs="Times New Roman"/>
+                <w:b/>
+                <w:bCs/>
               </w:rPr>
               <w:t>Role in study</w:t>
             </w:r>
@@ -6037,6 +6149,9 @@
         <w:tc>
           <w:tcPr>
             <w:tcW w:w="3120" w:type="dxa"/>
+            <w:tcBorders>
+              <w:top w:val="single" w:sz="4" w:space="0" w:color="auto"/>
+            </w:tcBorders>
           </w:tcPr>
           <w:p>
             <w:pPr>
@@ -6057,6 +6172,9 @@
         <w:tc>
           <w:tcPr>
             <w:tcW w:w="3120" w:type="dxa"/>
+            <w:tcBorders>
+              <w:top w:val="single" w:sz="4" w:space="0" w:color="auto"/>
+            </w:tcBorders>
           </w:tcPr>
           <w:p>
             <w:pPr>
@@ -6077,6 +6195,9 @@
         <w:tc>
           <w:tcPr>
             <w:tcW w:w="3120" w:type="dxa"/>
+            <w:tcBorders>
+              <w:top w:val="single" w:sz="4" w:space="0" w:color="auto"/>
+            </w:tcBorders>
           </w:tcPr>
           <w:p>
             <w:pPr>
@@ -6688,6 +6809,9 @@
         <w:tc>
           <w:tcPr>
             <w:tcW w:w="3120" w:type="dxa"/>
+            <w:tcBorders>
+              <w:bottom w:val="single" w:sz="4" w:space="0" w:color="auto"/>
+            </w:tcBorders>
           </w:tcPr>
           <w:p>
             <w:pPr>
@@ -6708,6 +6832,9 @@
         <w:tc>
           <w:tcPr>
             <w:tcW w:w="3120" w:type="dxa"/>
+            <w:tcBorders>
+              <w:bottom w:val="single" w:sz="4" w:space="0" w:color="auto"/>
+            </w:tcBorders>
           </w:tcPr>
           <w:p>
             <w:pPr>
@@ -6728,6 +6855,9 @@
         <w:tc>
           <w:tcPr>
             <w:tcW w:w="3120" w:type="dxa"/>
+            <w:tcBorders>
+              <w:bottom w:val="single" w:sz="4" w:space="0" w:color="auto"/>
+            </w:tcBorders>
           </w:tcPr>
           <w:p>
             <w:pPr>
@@ -6758,6 +6888,15 @@
           <w14:ligatures w14:val="none"/>
         </w:rPr>
       </w:pPr>
+      <w:r>
+        <w:rPr>
+          <w:rFonts w:ascii="Times New Roman" w:eastAsia="MS Mincho" w:hAnsi="Times New Roman" w:cs="Times New Roman"/>
+          <w:kern w:val="0"/>
+          <w:szCs w:val="22"/>
+          <w14:ligatures w14:val="none"/>
+        </w:rPr>
+        <w:t>Source: field survey (2026)</w:t>
+      </w:r>
     </w:p>
     <w:p>
       <w:pPr>
@@ -6847,7 +6986,25 @@
           <w:szCs w:val="22"/>
           <w14:ligatures w14:val="none"/>
         </w:rPr>
-        <w:t>These implications will be operationalised in Chapter Three through the benchmark scenarios, experimental controls, measurement procedures, trial structure, data-analysis approach, and Ethereum execution environment. Because the research has not yet been conducted, this chapter deliberately makes no claim about the results of the proposed experiment.</w:t>
+        <w:t xml:space="preserve">These implications will be </w:t>
+      </w:r>
+      <w:r>
+        <w:rPr>
+          <w:rFonts w:ascii="Times New Roman" w:eastAsia="MS Mincho" w:hAnsi="Times New Roman" w:cs="Times New Roman"/>
+          <w:kern w:val="0"/>
+          <w:szCs w:val="22"/>
+          <w14:ligatures w14:val="none"/>
+        </w:rPr>
+        <w:t>operationalized</w:t>
+      </w:r>
+      <w:r>
+        <w:rPr>
+          <w:rFonts w:ascii="Times New Roman" w:eastAsia="MS Mincho" w:hAnsi="Times New Roman" w:cs="Times New Roman"/>
+          <w:kern w:val="0"/>
+          <w:szCs w:val="22"/>
+          <w14:ligatures w14:val="none"/>
+        </w:rPr>
+        <w:t xml:space="preserve"> in Chapter Three through the benchmark scenarios, experimental controls, measurement procedures, trial structure, data-analysis approach, and Ethereum execution environment. Because the research has not yet been conducted, this chapter deliberately makes no claim about the results of the proposed experiment.</w:t>
       </w:r>
     </w:p>
     <w:p>
@@ -7700,7 +7857,23 @@
           <w:b/>
           <w:bCs/>
         </w:rPr>
-        <w:t>RQ 2</w:t>
+        <w:t>RQ</w:t>
+      </w:r>
+      <w:r>
+        <w:rPr>
+          <w:rFonts w:ascii="Times New Roman" w:hAnsi="Times New Roman" w:cs="Times New Roman"/>
+          <w:b/>
+          <w:bCs/>
+        </w:rPr>
+        <w:t xml:space="preserve"> </w:t>
+      </w:r>
+      <w:r>
+        <w:rPr>
+          <w:rFonts w:ascii="Times New Roman" w:hAnsi="Times New Roman" w:cs="Times New Roman"/>
+          <w:b/>
+          <w:bCs/>
+        </w:rPr>
+        <w:t>2</w:t>
       </w:r>
       <w:r>
         <w:rPr>
@@ -7731,15 +7904,6 @@
         </w:rPr>
         <w:t>: What is the computational cost of verifying the generated proofs on Ethereum?</w:t>
       </w:r>
-    </w:p>
-    <w:p>
-      <w:pPr>
-        <w:spacing w:line="360" w:lineRule="auto"/>
-        <w:jc w:val="both"/>
-        <w:rPr>
-          <w:rFonts w:ascii="Times New Roman" w:hAnsi="Times New Roman" w:cs="Times New Roman"/>
-        </w:rPr>
-      </w:pPr>
     </w:p>
     <w:p>
       <w:pPr>
@@ -7785,12 +7949,104 @@
         </w:rPr>
         <w:lastRenderedPageBreak/>
         <w:t>3.5.2 Mapping Research Questions to Variables</w:t>
+      </w:r>
+    </w:p>
+    <w:p>
+      <w:pPr>
+        <w:pStyle w:val="Caption"/>
+        <w:keepNext/>
+        <w:rPr>
+          <w:rFonts w:ascii="Times New Roman" w:hAnsi="Times New Roman" w:cs="Times New Roman"/>
+          <w:b/>
+          <w:bCs/>
+          <w:sz w:val="24"/>
+          <w:szCs w:val="24"/>
+        </w:rPr>
+      </w:pPr>
+      <w:r>
+        <w:rPr>
+          <w:rFonts w:ascii="Times New Roman" w:hAnsi="Times New Roman" w:cs="Times New Roman"/>
+          <w:b/>
+          <w:bCs/>
+          <w:sz w:val="24"/>
+          <w:szCs w:val="24"/>
+        </w:rPr>
+        <w:t xml:space="preserve">Table </w:t>
+      </w:r>
+      <w:r>
+        <w:rPr>
+          <w:rFonts w:ascii="Times New Roman" w:hAnsi="Times New Roman" w:cs="Times New Roman"/>
+          <w:b/>
+          <w:bCs/>
+          <w:sz w:val="24"/>
+          <w:szCs w:val="24"/>
+        </w:rPr>
+        <w:fldChar w:fldCharType="begin"/>
+      </w:r>
+      <w:r>
+        <w:rPr>
+          <w:rFonts w:ascii="Times New Roman" w:hAnsi="Times New Roman" w:cs="Times New Roman"/>
+          <w:b/>
+          <w:bCs/>
+          <w:sz w:val="24"/>
+          <w:szCs w:val="24"/>
+        </w:rPr>
+        <w:instrText xml:space="preserve"> SEQ Table \* ARABIC </w:instrText>
+      </w:r>
+      <w:r>
+        <w:rPr>
+          <w:rFonts w:ascii="Times New Roman" w:hAnsi="Times New Roman" w:cs="Times New Roman"/>
+          <w:b/>
+          <w:bCs/>
+          <w:sz w:val="24"/>
+          <w:szCs w:val="24"/>
+        </w:rPr>
+        <w:fldChar w:fldCharType="separate"/>
+      </w:r>
+      <w:r>
+        <w:rPr>
+          <w:rFonts w:ascii="Times New Roman" w:hAnsi="Times New Roman" w:cs="Times New Roman"/>
+          <w:b/>
+          <w:bCs/>
+          <w:noProof/>
+          <w:sz w:val="24"/>
+          <w:szCs w:val="24"/>
+        </w:rPr>
+        <w:t>3</w:t>
+      </w:r>
+      <w:r>
+        <w:rPr>
+          <w:rFonts w:ascii="Times New Roman" w:hAnsi="Times New Roman" w:cs="Times New Roman"/>
+          <w:b/>
+          <w:bCs/>
+          <w:sz w:val="24"/>
+          <w:szCs w:val="24"/>
+        </w:rPr>
+        <w:fldChar w:fldCharType="end"/>
+      </w:r>
+      <w:r>
+        <w:rPr>
+          <w:rFonts w:ascii="Times New Roman" w:hAnsi="Times New Roman" w:cs="Times New Roman"/>
+          <w:b/>
+          <w:bCs/>
+          <w:sz w:val="24"/>
+          <w:szCs w:val="24"/>
+        </w:rPr>
+        <w:t>: Variables Mapping</w:t>
       </w:r>
     </w:p>
     <w:tbl>
       <w:tblPr>
         <w:tblStyle w:val="GridTable1Light"/>
         <w:tblW w:w="0" w:type="auto"/>
+        <w:tblBorders>
+          <w:top w:val="none" w:sz="0" w:space="0" w:color="auto"/>
+          <w:left w:val="none" w:sz="0" w:space="0" w:color="auto"/>
+          <w:bottom w:val="none" w:sz="0" w:space="0" w:color="auto"/>
+          <w:right w:val="none" w:sz="0" w:space="0" w:color="auto"/>
+          <w:insideH w:val="none" w:sz="0" w:space="0" w:color="auto"/>
+          <w:insideV w:val="none" w:sz="0" w:space="0" w:color="auto"/>
+        </w:tblBorders>
         <w:tblLook w:val="04A0" w:firstRow="1" w:lastRow="0" w:firstColumn="1" w:lastColumn="0" w:noHBand="0" w:noVBand="1"/>
       </w:tblPr>
       <w:tblGrid>
@@ -7807,6 +8063,10 @@
           <w:tcPr>
             <w:cnfStyle w:val="001000000000" w:firstRow="0" w:lastRow="0" w:firstColumn="1" w:lastColumn="0" w:oddVBand="0" w:evenVBand="0" w:oddHBand="0" w:evenHBand="0" w:firstRowFirstColumn="0" w:firstRowLastColumn="0" w:lastRowFirstColumn="0" w:lastRowLastColumn="0"/>
             <w:tcW w:w="2157" w:type="dxa"/>
+            <w:tcBorders>
+              <w:top w:val="single" w:sz="4" w:space="0" w:color="auto"/>
+              <w:bottom w:val="single" w:sz="4" w:space="0" w:color="auto"/>
+            </w:tcBorders>
           </w:tcPr>
           <w:p>
             <w:pPr>
@@ -7827,6 +8087,10 @@
         <w:tc>
           <w:tcPr>
             <w:tcW w:w="2157" w:type="dxa"/>
+            <w:tcBorders>
+              <w:top w:val="single" w:sz="4" w:space="0" w:color="auto"/>
+              <w:bottom w:val="single" w:sz="4" w:space="0" w:color="auto"/>
+            </w:tcBorders>
           </w:tcPr>
           <w:p>
             <w:pPr>
@@ -7848,6 +8112,10 @@
         <w:tc>
           <w:tcPr>
             <w:tcW w:w="2158" w:type="dxa"/>
+            <w:tcBorders>
+              <w:top w:val="single" w:sz="4" w:space="0" w:color="auto"/>
+              <w:bottom w:val="single" w:sz="4" w:space="0" w:color="auto"/>
+            </w:tcBorders>
           </w:tcPr>
           <w:p>
             <w:pPr>
@@ -7869,6 +8137,10 @@
         <w:tc>
           <w:tcPr>
             <w:tcW w:w="2158" w:type="dxa"/>
+            <w:tcBorders>
+              <w:top w:val="single" w:sz="4" w:space="0" w:color="auto"/>
+              <w:bottom w:val="single" w:sz="4" w:space="0" w:color="auto"/>
+            </w:tcBorders>
           </w:tcPr>
           <w:p>
             <w:pPr>
@@ -7893,18 +8165,24 @@
           <w:tcPr>
             <w:cnfStyle w:val="001000000000" w:firstRow="0" w:lastRow="0" w:firstColumn="1" w:lastColumn="0" w:oddVBand="0" w:evenVBand="0" w:oddHBand="0" w:evenHBand="0" w:firstRowFirstColumn="0" w:firstRowLastColumn="0" w:lastRowFirstColumn="0" w:lastRowLastColumn="0"/>
             <w:tcW w:w="2157" w:type="dxa"/>
+            <w:tcBorders>
+              <w:top w:val="single" w:sz="4" w:space="0" w:color="auto"/>
+            </w:tcBorders>
           </w:tcPr>
           <w:p>
             <w:pPr>
               <w:spacing w:line="360" w:lineRule="auto"/>
-              <w:jc w:val="both"/>
-              <w:rPr>
-                <w:rFonts w:ascii="Times New Roman" w:hAnsi="Times New Roman" w:cs="Times New Roman"/>
-              </w:rPr>
-            </w:pPr>
-            <w:r>
-              <w:rPr>
-                <w:rFonts w:ascii="Times New Roman" w:hAnsi="Times New Roman" w:cs="Times New Roman"/>
+              <w:rPr>
+                <w:rFonts w:ascii="Times New Roman" w:hAnsi="Times New Roman" w:cs="Times New Roman"/>
+                <w:b w:val="0"/>
+                <w:bCs w:val="0"/>
+              </w:rPr>
+            </w:pPr>
+            <w:r>
+              <w:rPr>
+                <w:rFonts w:ascii="Times New Roman" w:hAnsi="Times New Roman" w:cs="Times New Roman"/>
+                <w:b w:val="0"/>
+                <w:bCs w:val="0"/>
               </w:rPr>
               <w:t>RQ1</w:t>
             </w:r>
@@ -7913,11 +8191,13 @@
         <w:tc>
           <w:tcPr>
             <w:tcW w:w="2157" w:type="dxa"/>
+            <w:tcBorders>
+              <w:top w:val="single" w:sz="4" w:space="0" w:color="auto"/>
+            </w:tcBorders>
           </w:tcPr>
           <w:p>
             <w:pPr>
               <w:spacing w:line="360" w:lineRule="auto"/>
-              <w:jc w:val="both"/>
               <w:cnfStyle w:val="000000000000" w:firstRow="0" w:lastRow="0" w:firstColumn="0" w:lastColumn="0" w:oddVBand="0" w:evenVBand="0" w:oddHBand="0" w:evenHBand="0" w:firstRowFirstColumn="0" w:firstRowLastColumn="0" w:lastRowFirstColumn="0" w:lastRowLastColumn="0"/>
               <w:rPr>
                 <w:rFonts w:ascii="Times New Roman" w:hAnsi="Times New Roman" w:cs="Times New Roman"/>
@@ -7934,11 +8214,13 @@
         <w:tc>
           <w:tcPr>
             <w:tcW w:w="2158" w:type="dxa"/>
+            <w:tcBorders>
+              <w:top w:val="single" w:sz="4" w:space="0" w:color="auto"/>
+            </w:tcBorders>
           </w:tcPr>
           <w:p>
             <w:pPr>
               <w:spacing w:line="360" w:lineRule="auto"/>
-              <w:jc w:val="both"/>
               <w:cnfStyle w:val="000000000000" w:firstRow="0" w:lastRow="0" w:firstColumn="0" w:lastColumn="0" w:oddVBand="0" w:evenVBand="0" w:oddHBand="0" w:evenHBand="0" w:firstRowFirstColumn="0" w:firstRowLastColumn="0" w:lastRowFirstColumn="0" w:lastRowLastColumn="0"/>
               <w:rPr>
                 <w:rFonts w:ascii="Times New Roman" w:hAnsi="Times New Roman" w:cs="Times New Roman"/>
@@ -7955,11 +8237,13 @@
         <w:tc>
           <w:tcPr>
             <w:tcW w:w="2158" w:type="dxa"/>
+            <w:tcBorders>
+              <w:top w:val="single" w:sz="4" w:space="0" w:color="auto"/>
+            </w:tcBorders>
           </w:tcPr>
           <w:p>
             <w:pPr>
               <w:spacing w:line="360" w:lineRule="auto"/>
-              <w:jc w:val="both"/>
               <w:cnfStyle w:val="000000000000" w:firstRow="0" w:lastRow="0" w:firstColumn="0" w:lastColumn="0" w:oddVBand="0" w:evenVBand="0" w:oddHBand="0" w:evenHBand="0" w:firstRowFirstColumn="0" w:firstRowLastColumn="0" w:lastRowFirstColumn="0" w:lastRowLastColumn="0"/>
               <w:rPr>
                 <w:rFonts w:ascii="Times New Roman" w:hAnsi="Times New Roman" w:cs="Times New Roman"/>
@@ -7983,14 +8267,17 @@
           <w:p>
             <w:pPr>
               <w:spacing w:line="360" w:lineRule="auto"/>
-              <w:jc w:val="both"/>
-              <w:rPr>
-                <w:rFonts w:ascii="Times New Roman" w:hAnsi="Times New Roman" w:cs="Times New Roman"/>
-              </w:rPr>
-            </w:pPr>
-            <w:r>
-              <w:rPr>
-                <w:rFonts w:ascii="Times New Roman" w:hAnsi="Times New Roman" w:cs="Times New Roman"/>
+              <w:rPr>
+                <w:rFonts w:ascii="Times New Roman" w:hAnsi="Times New Roman" w:cs="Times New Roman"/>
+                <w:b w:val="0"/>
+                <w:bCs w:val="0"/>
+              </w:rPr>
+            </w:pPr>
+            <w:r>
+              <w:rPr>
+                <w:rFonts w:ascii="Times New Roman" w:hAnsi="Times New Roman" w:cs="Times New Roman"/>
+                <w:b w:val="0"/>
+                <w:bCs w:val="0"/>
               </w:rPr>
               <w:t>RQ2</w:t>
             </w:r>
@@ -8003,7 +8290,6 @@
           <w:p>
             <w:pPr>
               <w:spacing w:line="360" w:lineRule="auto"/>
-              <w:jc w:val="both"/>
               <w:cnfStyle w:val="000000000000" w:firstRow="0" w:lastRow="0" w:firstColumn="0" w:lastColumn="0" w:oddVBand="0" w:evenVBand="0" w:oddHBand="0" w:evenHBand="0" w:firstRowFirstColumn="0" w:firstRowLastColumn="0" w:lastRowFirstColumn="0" w:lastRowLastColumn="0"/>
               <w:rPr>
                 <w:rFonts w:ascii="Times New Roman" w:hAnsi="Times New Roman" w:cs="Times New Roman"/>
@@ -8024,7 +8310,6 @@
           <w:p>
             <w:pPr>
               <w:spacing w:line="360" w:lineRule="auto"/>
-              <w:jc w:val="both"/>
               <w:cnfStyle w:val="000000000000" w:firstRow="0" w:lastRow="0" w:firstColumn="0" w:lastColumn="0" w:oddVBand="0" w:evenVBand="0" w:oddHBand="0" w:evenHBand="0" w:firstRowFirstColumn="0" w:firstRowLastColumn="0" w:lastRowFirstColumn="0" w:lastRowLastColumn="0"/>
               <w:rPr>
                 <w:rFonts w:ascii="Times New Roman" w:hAnsi="Times New Roman" w:cs="Times New Roman"/>
@@ -8045,7 +8330,6 @@
           <w:p>
             <w:pPr>
               <w:spacing w:line="360" w:lineRule="auto"/>
-              <w:jc w:val="both"/>
               <w:cnfStyle w:val="000000000000" w:firstRow="0" w:lastRow="0" w:firstColumn="0" w:lastColumn="0" w:oddVBand="0" w:evenVBand="0" w:oddHBand="0" w:evenHBand="0" w:firstRowFirstColumn="0" w:firstRowLastColumn="0" w:lastRowFirstColumn="0" w:lastRowLastColumn="0"/>
               <w:rPr>
                 <w:rFonts w:ascii="Times New Roman" w:hAnsi="Times New Roman" w:cs="Times New Roman"/>
@@ -8069,14 +8353,17 @@
           <w:p>
             <w:pPr>
               <w:spacing w:line="360" w:lineRule="auto"/>
-              <w:jc w:val="both"/>
-              <w:rPr>
-                <w:rFonts w:ascii="Times New Roman" w:hAnsi="Times New Roman" w:cs="Times New Roman"/>
-              </w:rPr>
-            </w:pPr>
-            <w:r>
-              <w:rPr>
-                <w:rFonts w:ascii="Times New Roman" w:hAnsi="Times New Roman" w:cs="Times New Roman"/>
+              <w:rPr>
+                <w:rFonts w:ascii="Times New Roman" w:hAnsi="Times New Roman" w:cs="Times New Roman"/>
+                <w:b w:val="0"/>
+                <w:bCs w:val="0"/>
+              </w:rPr>
+            </w:pPr>
+            <w:r>
+              <w:rPr>
+                <w:rFonts w:ascii="Times New Roman" w:hAnsi="Times New Roman" w:cs="Times New Roman"/>
+                <w:b w:val="0"/>
+                <w:bCs w:val="0"/>
               </w:rPr>
               <w:t>RQ3</w:t>
             </w:r>
@@ -8089,7 +8376,6 @@
           <w:p>
             <w:pPr>
               <w:spacing w:line="360" w:lineRule="auto"/>
-              <w:jc w:val="both"/>
               <w:cnfStyle w:val="000000000000" w:firstRow="0" w:lastRow="0" w:firstColumn="0" w:lastColumn="0" w:oddVBand="0" w:evenVBand="0" w:oddHBand="0" w:evenHBand="0" w:firstRowFirstColumn="0" w:firstRowLastColumn="0" w:lastRowFirstColumn="0" w:lastRowLastColumn="0"/>
               <w:rPr>
                 <w:rFonts w:ascii="Times New Roman" w:hAnsi="Times New Roman" w:cs="Times New Roman"/>
@@ -8110,7 +8396,6 @@
           <w:p>
             <w:pPr>
               <w:spacing w:line="360" w:lineRule="auto"/>
-              <w:jc w:val="both"/>
               <w:cnfStyle w:val="000000000000" w:firstRow="0" w:lastRow="0" w:firstColumn="0" w:lastColumn="0" w:oddVBand="0" w:evenVBand="0" w:oddHBand="0" w:evenHBand="0" w:firstRowFirstColumn="0" w:firstRowLastColumn="0" w:lastRowFirstColumn="0" w:lastRowLastColumn="0"/>
               <w:rPr>
                 <w:rFonts w:ascii="Times New Roman" w:hAnsi="Times New Roman" w:cs="Times New Roman"/>
@@ -8131,7 +8416,6 @@
           <w:p>
             <w:pPr>
               <w:spacing w:line="360" w:lineRule="auto"/>
-              <w:jc w:val="both"/>
               <w:cnfStyle w:val="000000000000" w:firstRow="0" w:lastRow="0" w:firstColumn="0" w:lastColumn="0" w:oddVBand="0" w:evenVBand="0" w:oddHBand="0" w:evenHBand="0" w:firstRowFirstColumn="0" w:firstRowLastColumn="0" w:lastRowFirstColumn="0" w:lastRowLastColumn="0"/>
               <w:rPr>
                 <w:rFonts w:ascii="Times New Roman" w:hAnsi="Times New Roman" w:cs="Times New Roman"/>
@@ -8151,18 +8435,24 @@
           <w:tcPr>
             <w:cnfStyle w:val="001000000000" w:firstRow="0" w:lastRow="0" w:firstColumn="1" w:lastColumn="0" w:oddVBand="0" w:evenVBand="0" w:oddHBand="0" w:evenHBand="0" w:firstRowFirstColumn="0" w:firstRowLastColumn="0" w:lastRowFirstColumn="0" w:lastRowLastColumn="0"/>
             <w:tcW w:w="2157" w:type="dxa"/>
+            <w:tcBorders>
+              <w:bottom w:val="single" w:sz="4" w:space="0" w:color="auto"/>
+            </w:tcBorders>
           </w:tcPr>
           <w:p>
             <w:pPr>
               <w:spacing w:line="360" w:lineRule="auto"/>
-              <w:jc w:val="both"/>
-              <w:rPr>
-                <w:rFonts w:ascii="Times New Roman" w:hAnsi="Times New Roman" w:cs="Times New Roman"/>
-              </w:rPr>
-            </w:pPr>
-            <w:r>
-              <w:rPr>
-                <w:rFonts w:ascii="Times New Roman" w:hAnsi="Times New Roman" w:cs="Times New Roman"/>
+              <w:rPr>
+                <w:rFonts w:ascii="Times New Roman" w:hAnsi="Times New Roman" w:cs="Times New Roman"/>
+                <w:b w:val="0"/>
+                <w:bCs w:val="0"/>
+              </w:rPr>
+            </w:pPr>
+            <w:r>
+              <w:rPr>
+                <w:rFonts w:ascii="Times New Roman" w:hAnsi="Times New Roman" w:cs="Times New Roman"/>
+                <w:b w:val="0"/>
+                <w:bCs w:val="0"/>
               </w:rPr>
               <w:t>RQ4</w:t>
             </w:r>
@@ -8171,11 +8461,13 @@
         <w:tc>
           <w:tcPr>
             <w:tcW w:w="2157" w:type="dxa"/>
+            <w:tcBorders>
+              <w:bottom w:val="single" w:sz="4" w:space="0" w:color="auto"/>
+            </w:tcBorders>
           </w:tcPr>
           <w:p>
             <w:pPr>
               <w:spacing w:line="360" w:lineRule="auto"/>
-              <w:jc w:val="both"/>
               <w:cnfStyle w:val="000000000000" w:firstRow="0" w:lastRow="0" w:firstColumn="0" w:lastColumn="0" w:oddVBand="0" w:evenVBand="0" w:oddHBand="0" w:evenHBand="0" w:firstRowFirstColumn="0" w:firstRowLastColumn="0" w:lastRowFirstColumn="0" w:lastRowLastColumn="0"/>
               <w:rPr>
                 <w:rFonts w:ascii="Times New Roman" w:hAnsi="Times New Roman" w:cs="Times New Roman"/>
@@ -8192,11 +8484,13 @@
         <w:tc>
           <w:tcPr>
             <w:tcW w:w="2158" w:type="dxa"/>
+            <w:tcBorders>
+              <w:bottom w:val="single" w:sz="4" w:space="0" w:color="auto"/>
+            </w:tcBorders>
           </w:tcPr>
           <w:p>
             <w:pPr>
               <w:spacing w:line="360" w:lineRule="auto"/>
-              <w:jc w:val="both"/>
               <w:cnfStyle w:val="000000000000" w:firstRow="0" w:lastRow="0" w:firstColumn="0" w:lastColumn="0" w:oddVBand="0" w:evenVBand="0" w:oddHBand="0" w:evenHBand="0" w:firstRowFirstColumn="0" w:firstRowLastColumn="0" w:lastRowFirstColumn="0" w:lastRowLastColumn="0"/>
               <w:rPr>
                 <w:rFonts w:ascii="Times New Roman" w:hAnsi="Times New Roman" w:cs="Times New Roman"/>
@@ -8213,11 +8507,13 @@
         <w:tc>
           <w:tcPr>
             <w:tcW w:w="2158" w:type="dxa"/>
+            <w:tcBorders>
+              <w:bottom w:val="single" w:sz="4" w:space="0" w:color="auto"/>
+            </w:tcBorders>
           </w:tcPr>
           <w:p>
             <w:pPr>
               <w:spacing w:line="360" w:lineRule="auto"/>
-              <w:jc w:val="both"/>
               <w:cnfStyle w:val="000000000000" w:firstRow="0" w:lastRow="0" w:firstColumn="0" w:lastColumn="0" w:oddVBand="0" w:evenVBand="0" w:oddHBand="0" w:evenHBand="0" w:firstRowFirstColumn="0" w:firstRowLastColumn="0" w:lastRowFirstColumn="0" w:lastRowLastColumn="0"/>
               <w:rPr>
                 <w:rFonts w:ascii="Times New Roman" w:hAnsi="Times New Roman" w:cs="Times New Roman"/>
@@ -8241,6 +8537,12 @@
           <w:rFonts w:ascii="Times New Roman" w:hAnsi="Times New Roman" w:cs="Times New Roman"/>
         </w:rPr>
       </w:pPr>
+      <w:r>
+        <w:rPr>
+          <w:rFonts w:ascii="Times New Roman" w:hAnsi="Times New Roman" w:cs="Times New Roman"/>
+        </w:rPr>
+        <w:t>Source: field study (2026)</w:t>
+      </w:r>
     </w:p>
     <w:p>
       <w:pPr>
@@ -8353,6 +8655,7 @@
           <w:b/>
           <w:bCs/>
         </w:rPr>
+        <w:lastRenderedPageBreak/>
         <w:t>Noir Circuit Development &amp; Compilation</w:t>
       </w:r>
       <w:r>
@@ -8376,7 +8679,6 @@
           <w:b/>
           <w:bCs/>
         </w:rPr>
-        <w:lastRenderedPageBreak/>
         <w:t>Off-Chain Witness &amp; Proof Generation</w:t>
       </w:r>
       <w:r>
@@ -8513,28 +8815,131 @@
         <w:t>Circuit complexity is systematically scaled across benchmark scenarios by varying the attribute set size and predicate complexity.</w:t>
       </w:r>
     </w:p>
+    <w:p>
+      <w:pPr>
+        <w:pStyle w:val="Caption"/>
+        <w:keepNext/>
+        <w:rPr>
+          <w:rFonts w:ascii="Times New Roman" w:hAnsi="Times New Roman" w:cs="Times New Roman"/>
+          <w:b/>
+          <w:bCs/>
+          <w:color w:val="auto"/>
+          <w:sz w:val="24"/>
+          <w:szCs w:val="24"/>
+        </w:rPr>
+      </w:pPr>
+      <w:r>
+        <w:rPr>
+          <w:rFonts w:ascii="Times New Roman" w:hAnsi="Times New Roman" w:cs="Times New Roman"/>
+          <w:b/>
+          <w:bCs/>
+          <w:color w:val="auto"/>
+          <w:sz w:val="24"/>
+          <w:szCs w:val="24"/>
+        </w:rPr>
+        <w:t xml:space="preserve">Table </w:t>
+      </w:r>
+      <w:r>
+        <w:rPr>
+          <w:rFonts w:ascii="Times New Roman" w:hAnsi="Times New Roman" w:cs="Times New Roman"/>
+          <w:b/>
+          <w:bCs/>
+          <w:color w:val="auto"/>
+          <w:sz w:val="24"/>
+          <w:szCs w:val="24"/>
+        </w:rPr>
+        <w:fldChar w:fldCharType="begin"/>
+      </w:r>
+      <w:r>
+        <w:rPr>
+          <w:rFonts w:ascii="Times New Roman" w:hAnsi="Times New Roman" w:cs="Times New Roman"/>
+          <w:b/>
+          <w:bCs/>
+          <w:color w:val="auto"/>
+          <w:sz w:val="24"/>
+          <w:szCs w:val="24"/>
+        </w:rPr>
+        <w:instrText xml:space="preserve"> SEQ Table \* ARABIC </w:instrText>
+      </w:r>
+      <w:r>
+        <w:rPr>
+          <w:rFonts w:ascii="Times New Roman" w:hAnsi="Times New Roman" w:cs="Times New Roman"/>
+          <w:b/>
+          <w:bCs/>
+          <w:color w:val="auto"/>
+          <w:sz w:val="24"/>
+          <w:szCs w:val="24"/>
+        </w:rPr>
+        <w:fldChar w:fldCharType="separate"/>
+      </w:r>
+      <w:r>
+        <w:rPr>
+          <w:rFonts w:ascii="Times New Roman" w:hAnsi="Times New Roman" w:cs="Times New Roman"/>
+          <w:b/>
+          <w:bCs/>
+          <w:noProof/>
+          <w:color w:val="auto"/>
+          <w:sz w:val="24"/>
+          <w:szCs w:val="24"/>
+        </w:rPr>
+        <w:t>4</w:t>
+      </w:r>
+      <w:r>
+        <w:rPr>
+          <w:rFonts w:ascii="Times New Roman" w:hAnsi="Times New Roman" w:cs="Times New Roman"/>
+          <w:b/>
+          <w:bCs/>
+          <w:color w:val="auto"/>
+          <w:sz w:val="24"/>
+          <w:szCs w:val="24"/>
+        </w:rPr>
+        <w:fldChar w:fldCharType="end"/>
+      </w:r>
+      <w:r>
+        <w:rPr>
+          <w:rFonts w:ascii="Times New Roman" w:hAnsi="Times New Roman" w:cs="Times New Roman"/>
+          <w:b/>
+          <w:bCs/>
+          <w:color w:val="auto"/>
+          <w:sz w:val="24"/>
+          <w:szCs w:val="24"/>
+        </w:rPr>
+        <w:t>: Test Scenarios</w:t>
+      </w:r>
+    </w:p>
     <w:tbl>
       <w:tblPr>
         <w:tblStyle w:val="TableGrid"/>
         <w:tblW w:w="0" w:type="auto"/>
+        <w:tblBorders>
+          <w:top w:val="none" w:sz="0" w:space="0" w:color="auto"/>
+          <w:left w:val="none" w:sz="0" w:space="0" w:color="auto"/>
+          <w:bottom w:val="none" w:sz="0" w:space="0" w:color="auto"/>
+          <w:right w:val="none" w:sz="0" w:space="0" w:color="auto"/>
+          <w:insideH w:val="none" w:sz="0" w:space="0" w:color="auto"/>
+          <w:insideV w:val="none" w:sz="0" w:space="0" w:color="auto"/>
+        </w:tblBorders>
         <w:tblLook w:val="04A0" w:firstRow="1" w:lastRow="0" w:firstColumn="1" w:lastColumn="0" w:noHBand="0" w:noVBand="1"/>
       </w:tblPr>
       <w:tblGrid>
         <w:gridCol w:w="2590"/>
         <w:gridCol w:w="2590"/>
-        <w:gridCol w:w="2590"/>
-        <w:gridCol w:w="2590"/>
+        <w:gridCol w:w="1930"/>
+        <w:gridCol w:w="3250"/>
         <w:gridCol w:w="2590"/>
       </w:tblGrid>
       <w:tr>
         <w:tc>
           <w:tcPr>
             <w:tcW w:w="2590" w:type="dxa"/>
+            <w:tcBorders>
+              <w:top w:val="single" w:sz="4" w:space="0" w:color="auto"/>
+              <w:bottom w:val="single" w:sz="4" w:space="0" w:color="auto"/>
+            </w:tcBorders>
           </w:tcPr>
           <w:p>
             <w:pPr>
               <w:spacing w:after="160" w:line="360" w:lineRule="auto"/>
-              <w:jc w:val="both"/>
               <w:rPr>
                 <w:rFonts w:ascii="Times New Roman" w:hAnsi="Times New Roman" w:cs="Times New Roman"/>
                 <w:b/>
@@ -8554,11 +8959,14 @@
         <w:tc>
           <w:tcPr>
             <w:tcW w:w="2590" w:type="dxa"/>
+            <w:tcBorders>
+              <w:top w:val="single" w:sz="4" w:space="0" w:color="auto"/>
+              <w:bottom w:val="single" w:sz="4" w:space="0" w:color="auto"/>
+            </w:tcBorders>
           </w:tcPr>
           <w:p>
             <w:pPr>
               <w:spacing w:after="160" w:line="360" w:lineRule="auto"/>
-              <w:jc w:val="both"/>
               <w:rPr>
                 <w:rFonts w:ascii="Times New Roman" w:hAnsi="Times New Roman" w:cs="Times New Roman"/>
                 <w:b/>
@@ -8577,12 +8985,15 @@
         </w:tc>
         <w:tc>
           <w:tcPr>
-            <w:tcW w:w="2590" w:type="dxa"/>
+            <w:tcW w:w="1930" w:type="dxa"/>
+            <w:tcBorders>
+              <w:top w:val="single" w:sz="4" w:space="0" w:color="auto"/>
+              <w:bottom w:val="single" w:sz="4" w:space="0" w:color="auto"/>
+            </w:tcBorders>
           </w:tcPr>
           <w:p>
             <w:pPr>
               <w:spacing w:after="160" w:line="360" w:lineRule="auto"/>
-              <w:jc w:val="both"/>
               <w:rPr>
                 <w:rFonts w:ascii="Times New Roman" w:hAnsi="Times New Roman" w:cs="Times New Roman"/>
                 <w:b/>
@@ -8601,12 +9012,15 @@
         </w:tc>
         <w:tc>
           <w:tcPr>
-            <w:tcW w:w="2590" w:type="dxa"/>
+            <w:tcW w:w="3250" w:type="dxa"/>
+            <w:tcBorders>
+              <w:top w:val="single" w:sz="4" w:space="0" w:color="auto"/>
+              <w:bottom w:val="single" w:sz="4" w:space="0" w:color="auto"/>
+            </w:tcBorders>
           </w:tcPr>
           <w:p>
             <w:pPr>
               <w:spacing w:after="160" w:line="360" w:lineRule="auto"/>
-              <w:jc w:val="both"/>
               <w:rPr>
                 <w:rFonts w:ascii="Times New Roman" w:hAnsi="Times New Roman" w:cs="Times New Roman"/>
                 <w:b/>
@@ -8626,11 +9040,14 @@
         <w:tc>
           <w:tcPr>
             <w:tcW w:w="2590" w:type="dxa"/>
+            <w:tcBorders>
+              <w:top w:val="single" w:sz="4" w:space="0" w:color="auto"/>
+              <w:bottom w:val="single" w:sz="4" w:space="0" w:color="auto"/>
+            </w:tcBorders>
           </w:tcPr>
           <w:p>
             <w:pPr>
               <w:spacing w:after="160" w:line="360" w:lineRule="auto"/>
-              <w:jc w:val="both"/>
               <w:rPr>
                 <w:rFonts w:ascii="Times New Roman" w:hAnsi="Times New Roman" w:cs="Times New Roman"/>
                 <w:b/>
@@ -8652,11 +9069,13 @@
         <w:tc>
           <w:tcPr>
             <w:tcW w:w="2590" w:type="dxa"/>
+            <w:tcBorders>
+              <w:top w:val="single" w:sz="4" w:space="0" w:color="auto"/>
+            </w:tcBorders>
           </w:tcPr>
           <w:p>
             <w:pPr>
               <w:spacing w:after="160" w:line="360" w:lineRule="auto"/>
-              <w:jc w:val="both"/>
               <w:rPr>
                 <w:rFonts w:ascii="Times New Roman" w:hAnsi="Times New Roman" w:cs="Times New Roman"/>
               </w:rPr>
@@ -8672,11 +9091,13 @@
         <w:tc>
           <w:tcPr>
             <w:tcW w:w="2590" w:type="dxa"/>
+            <w:tcBorders>
+              <w:top w:val="single" w:sz="4" w:space="0" w:color="auto"/>
+            </w:tcBorders>
           </w:tcPr>
           <w:p>
             <w:pPr>
               <w:spacing w:after="160" w:line="360" w:lineRule="auto"/>
-              <w:jc w:val="both"/>
               <w:rPr>
                 <w:rFonts w:ascii="Times New Roman" w:hAnsi="Times New Roman" w:cs="Times New Roman"/>
               </w:rPr>
@@ -8691,52 +9112,58 @@
         </w:tc>
         <w:tc>
           <w:tcPr>
+            <w:tcW w:w="1930" w:type="dxa"/>
+            <w:tcBorders>
+              <w:top w:val="single" w:sz="4" w:space="0" w:color="auto"/>
+            </w:tcBorders>
+          </w:tcPr>
+          <w:p>
+            <w:pPr>
+              <w:spacing w:after="160" w:line="360" w:lineRule="auto"/>
+              <w:rPr>
+                <w:rFonts w:ascii="Times New Roman" w:hAnsi="Times New Roman" w:cs="Times New Roman"/>
+              </w:rPr>
+            </w:pPr>
+            <w:r>
+              <w:rPr>
+                <w:rFonts w:ascii="Times New Roman" w:hAnsi="Times New Roman" w:cs="Times New Roman"/>
+              </w:rPr>
+              <w:t>1 Attribute</w:t>
+            </w:r>
+          </w:p>
+        </w:tc>
+        <w:tc>
+          <w:tcPr>
+            <w:tcW w:w="3250" w:type="dxa"/>
+            <w:tcBorders>
+              <w:top w:val="single" w:sz="4" w:space="0" w:color="auto"/>
+            </w:tcBorders>
+          </w:tcPr>
+          <w:p>
+            <w:pPr>
+              <w:spacing w:after="160" w:line="360" w:lineRule="auto"/>
+              <w:rPr>
+                <w:rFonts w:ascii="Times New Roman" w:hAnsi="Times New Roman" w:cs="Times New Roman"/>
+              </w:rPr>
+            </w:pPr>
+            <w:r>
+              <w:rPr>
+                <w:rFonts w:ascii="Times New Roman" w:hAnsi="Times New Roman" w:cs="Times New Roman"/>
+              </w:rPr>
+              <w:t>Minimal Range Check</w:t>
+            </w:r>
+          </w:p>
+        </w:tc>
+        <w:tc>
+          <w:tcPr>
             <w:tcW w:w="2590" w:type="dxa"/>
+            <w:tcBorders>
+              <w:top w:val="single" w:sz="4" w:space="0" w:color="auto"/>
+            </w:tcBorders>
           </w:tcPr>
           <w:p>
             <w:pPr>
               <w:spacing w:after="160" w:line="360" w:lineRule="auto"/>
-              <w:jc w:val="both"/>
-              <w:rPr>
-                <w:rFonts w:ascii="Times New Roman" w:hAnsi="Times New Roman" w:cs="Times New Roman"/>
-              </w:rPr>
-            </w:pPr>
-            <w:r>
-              <w:rPr>
-                <w:rFonts w:ascii="Times New Roman" w:hAnsi="Times New Roman" w:cs="Times New Roman"/>
-              </w:rPr>
-              <w:t>1 Attribute</w:t>
-            </w:r>
-          </w:p>
-        </w:tc>
-        <w:tc>
-          <w:tcPr>
-            <w:tcW w:w="2590" w:type="dxa"/>
-          </w:tcPr>
-          <w:p>
-            <w:pPr>
-              <w:spacing w:after="160" w:line="360" w:lineRule="auto"/>
-              <w:jc w:val="both"/>
-              <w:rPr>
-                <w:rFonts w:ascii="Times New Roman" w:hAnsi="Times New Roman" w:cs="Times New Roman"/>
-              </w:rPr>
-            </w:pPr>
-            <w:r>
-              <w:rPr>
-                <w:rFonts w:ascii="Times New Roman" w:hAnsi="Times New Roman" w:cs="Times New Roman"/>
-              </w:rPr>
-              <w:t>Minimal Range Check</w:t>
-            </w:r>
-          </w:p>
-        </w:tc>
-        <w:tc>
-          <w:tcPr>
-            <w:tcW w:w="2590" w:type="dxa"/>
-          </w:tcPr>
-          <w:p>
-            <w:pPr>
-              <w:spacing w:after="160" w:line="360" w:lineRule="auto"/>
-              <w:jc w:val="both"/>
               <w:rPr>
                 <w:rFonts w:ascii="Times New Roman" w:hAnsi="Times New Roman" w:cs="Times New Roman"/>
               </w:rPr>
@@ -8758,7 +9185,6 @@
           <w:p>
             <w:pPr>
               <w:spacing w:after="160" w:line="360" w:lineRule="auto"/>
-              <w:jc w:val="both"/>
               <w:rPr>
                 <w:rFonts w:ascii="Times New Roman" w:hAnsi="Times New Roman" w:cs="Times New Roman"/>
               </w:rPr>
@@ -8778,7 +9204,6 @@
           <w:p>
             <w:pPr>
               <w:spacing w:after="160" w:line="360" w:lineRule="auto"/>
-              <w:jc w:val="both"/>
               <w:rPr>
                 <w:rFonts w:ascii="Times New Roman" w:hAnsi="Times New Roman" w:cs="Times New Roman"/>
               </w:rPr>
@@ -8793,52 +9218,49 @@
         </w:tc>
         <w:tc>
           <w:tcPr>
+            <w:tcW w:w="1930" w:type="dxa"/>
+          </w:tcPr>
+          <w:p>
+            <w:pPr>
+              <w:spacing w:after="160" w:line="360" w:lineRule="auto"/>
+              <w:rPr>
+                <w:rFonts w:ascii="Times New Roman" w:hAnsi="Times New Roman" w:cs="Times New Roman"/>
+              </w:rPr>
+            </w:pPr>
+            <w:r>
+              <w:rPr>
+                <w:rFonts w:ascii="Times New Roman" w:hAnsi="Times New Roman" w:cs="Times New Roman"/>
+              </w:rPr>
+              <w:t>4 Attributes</w:t>
+            </w:r>
+          </w:p>
+        </w:tc>
+        <w:tc>
+          <w:tcPr>
+            <w:tcW w:w="3250" w:type="dxa"/>
+          </w:tcPr>
+          <w:p>
+            <w:pPr>
+              <w:spacing w:after="160" w:line="360" w:lineRule="auto"/>
+              <w:rPr>
+                <w:rFonts w:ascii="Times New Roman" w:hAnsi="Times New Roman" w:cs="Times New Roman"/>
+              </w:rPr>
+            </w:pPr>
+            <w:r>
+              <w:rPr>
+                <w:rFonts w:ascii="Times New Roman" w:hAnsi="Times New Roman" w:cs="Times New Roman"/>
+              </w:rPr>
+              <w:t>Moderate Predicate verification</w:t>
+            </w:r>
+          </w:p>
+        </w:tc>
+        <w:tc>
+          <w:tcPr>
             <w:tcW w:w="2590" w:type="dxa"/>
           </w:tcPr>
           <w:p>
             <w:pPr>
               <w:spacing w:after="160" w:line="360" w:lineRule="auto"/>
-              <w:jc w:val="both"/>
-              <w:rPr>
-                <w:rFonts w:ascii="Times New Roman" w:hAnsi="Times New Roman" w:cs="Times New Roman"/>
-              </w:rPr>
-            </w:pPr>
-            <w:r>
-              <w:rPr>
-                <w:rFonts w:ascii="Times New Roman" w:hAnsi="Times New Roman" w:cs="Times New Roman"/>
-              </w:rPr>
-              <w:t>4 Attributes</w:t>
-            </w:r>
-          </w:p>
-        </w:tc>
-        <w:tc>
-          <w:tcPr>
-            <w:tcW w:w="2590" w:type="dxa"/>
-          </w:tcPr>
-          <w:p>
-            <w:pPr>
-              <w:spacing w:after="160" w:line="360" w:lineRule="auto"/>
-              <w:jc w:val="both"/>
-              <w:rPr>
-                <w:rFonts w:ascii="Times New Roman" w:hAnsi="Times New Roman" w:cs="Times New Roman"/>
-              </w:rPr>
-            </w:pPr>
-            <w:r>
-              <w:rPr>
-                <w:rFonts w:ascii="Times New Roman" w:hAnsi="Times New Roman" w:cs="Times New Roman"/>
-              </w:rPr>
-              <w:t>Moderate Predicate verification</w:t>
-            </w:r>
-          </w:p>
-        </w:tc>
-        <w:tc>
-          <w:tcPr>
-            <w:tcW w:w="2590" w:type="dxa"/>
-          </w:tcPr>
-          <w:p>
-            <w:pPr>
-              <w:spacing w:after="160" w:line="360" w:lineRule="auto"/>
-              <w:jc w:val="both"/>
               <w:rPr>
                 <w:rFonts w:ascii="Times New Roman" w:hAnsi="Times New Roman" w:cs="Times New Roman"/>
               </w:rPr>
@@ -8860,7 +9282,6 @@
           <w:p>
             <w:pPr>
               <w:spacing w:after="160" w:line="360" w:lineRule="auto"/>
-              <w:jc w:val="both"/>
               <w:rPr>
                 <w:rFonts w:ascii="Times New Roman" w:hAnsi="Times New Roman" w:cs="Times New Roman"/>
               </w:rPr>
@@ -8880,7 +9301,6 @@
           <w:p>
             <w:pPr>
               <w:spacing w:after="160" w:line="360" w:lineRule="auto"/>
-              <w:jc w:val="both"/>
               <w:rPr>
                 <w:rFonts w:ascii="Times New Roman" w:hAnsi="Times New Roman" w:cs="Times New Roman"/>
               </w:rPr>
@@ -8895,52 +9315,49 @@
         </w:tc>
         <w:tc>
           <w:tcPr>
+            <w:tcW w:w="1930" w:type="dxa"/>
+          </w:tcPr>
+          <w:p>
+            <w:pPr>
+              <w:spacing w:after="160" w:line="360" w:lineRule="auto"/>
+              <w:rPr>
+                <w:rFonts w:ascii="Times New Roman" w:hAnsi="Times New Roman" w:cs="Times New Roman"/>
+              </w:rPr>
+            </w:pPr>
+            <w:r>
+              <w:rPr>
+                <w:rFonts w:ascii="Times New Roman" w:hAnsi="Times New Roman" w:cs="Times New Roman"/>
+              </w:rPr>
+              <w:t>8 Attributes</w:t>
+            </w:r>
+          </w:p>
+        </w:tc>
+        <w:tc>
+          <w:tcPr>
+            <w:tcW w:w="3250" w:type="dxa"/>
+          </w:tcPr>
+          <w:p>
+            <w:pPr>
+              <w:spacing w:after="160" w:line="360" w:lineRule="auto"/>
+              <w:rPr>
+                <w:rFonts w:ascii="Times New Roman" w:hAnsi="Times New Roman" w:cs="Times New Roman"/>
+              </w:rPr>
+            </w:pPr>
+            <w:r>
+              <w:rPr>
+                <w:rFonts w:ascii="Times New Roman" w:hAnsi="Times New Roman" w:cs="Times New Roman"/>
+              </w:rPr>
+              <w:t>Complex Hash and Range Checks</w:t>
+            </w:r>
+          </w:p>
+        </w:tc>
+        <w:tc>
+          <w:tcPr>
             <w:tcW w:w="2590" w:type="dxa"/>
           </w:tcPr>
           <w:p>
             <w:pPr>
               <w:spacing w:after="160" w:line="360" w:lineRule="auto"/>
-              <w:jc w:val="both"/>
-              <w:rPr>
-                <w:rFonts w:ascii="Times New Roman" w:hAnsi="Times New Roman" w:cs="Times New Roman"/>
-              </w:rPr>
-            </w:pPr>
-            <w:r>
-              <w:rPr>
-                <w:rFonts w:ascii="Times New Roman" w:hAnsi="Times New Roman" w:cs="Times New Roman"/>
-              </w:rPr>
-              <w:t>8 Attributes</w:t>
-            </w:r>
-          </w:p>
-        </w:tc>
-        <w:tc>
-          <w:tcPr>
-            <w:tcW w:w="2590" w:type="dxa"/>
-          </w:tcPr>
-          <w:p>
-            <w:pPr>
-              <w:spacing w:after="160" w:line="360" w:lineRule="auto"/>
-              <w:jc w:val="both"/>
-              <w:rPr>
-                <w:rFonts w:ascii="Times New Roman" w:hAnsi="Times New Roman" w:cs="Times New Roman"/>
-              </w:rPr>
-            </w:pPr>
-            <w:r>
-              <w:rPr>
-                <w:rFonts w:ascii="Times New Roman" w:hAnsi="Times New Roman" w:cs="Times New Roman"/>
-              </w:rPr>
-              <w:t>Complex Hash and Range Checks</w:t>
-            </w:r>
-          </w:p>
-        </w:tc>
-        <w:tc>
-          <w:tcPr>
-            <w:tcW w:w="2590" w:type="dxa"/>
-          </w:tcPr>
-          <w:p>
-            <w:pPr>
-              <w:spacing w:after="160" w:line="360" w:lineRule="auto"/>
-              <w:jc w:val="both"/>
               <w:rPr>
                 <w:rFonts w:ascii="Times New Roman" w:hAnsi="Times New Roman" w:cs="Times New Roman"/>
               </w:rPr>
@@ -8958,11 +9375,13 @@
         <w:tc>
           <w:tcPr>
             <w:tcW w:w="2590" w:type="dxa"/>
+            <w:tcBorders>
+              <w:bottom w:val="single" w:sz="4" w:space="0" w:color="auto"/>
+            </w:tcBorders>
           </w:tcPr>
           <w:p>
             <w:pPr>
               <w:spacing w:after="160" w:line="360" w:lineRule="auto"/>
-              <w:jc w:val="both"/>
               <w:rPr>
                 <w:rFonts w:ascii="Times New Roman" w:hAnsi="Times New Roman" w:cs="Times New Roman"/>
               </w:rPr>
@@ -8978,11 +9397,13 @@
         <w:tc>
           <w:tcPr>
             <w:tcW w:w="2590" w:type="dxa"/>
+            <w:tcBorders>
+              <w:bottom w:val="single" w:sz="4" w:space="0" w:color="auto"/>
+            </w:tcBorders>
           </w:tcPr>
           <w:p>
             <w:pPr>
               <w:spacing w:after="160" w:line="360" w:lineRule="auto"/>
-              <w:jc w:val="both"/>
               <w:rPr>
                 <w:rFonts w:ascii="Times New Roman" w:hAnsi="Times New Roman" w:cs="Times New Roman"/>
               </w:rPr>
@@ -8997,52 +9418,58 @@
         </w:tc>
         <w:tc>
           <w:tcPr>
+            <w:tcW w:w="1930" w:type="dxa"/>
+            <w:tcBorders>
+              <w:bottom w:val="single" w:sz="4" w:space="0" w:color="auto"/>
+            </w:tcBorders>
+          </w:tcPr>
+          <w:p>
+            <w:pPr>
+              <w:spacing w:after="160" w:line="360" w:lineRule="auto"/>
+              <w:rPr>
+                <w:rFonts w:ascii="Times New Roman" w:hAnsi="Times New Roman" w:cs="Times New Roman"/>
+              </w:rPr>
+            </w:pPr>
+            <w:r>
+              <w:rPr>
+                <w:rFonts w:ascii="Times New Roman" w:hAnsi="Times New Roman" w:cs="Times New Roman"/>
+              </w:rPr>
+              <w:t>16 Attributes</w:t>
+            </w:r>
+          </w:p>
+        </w:tc>
+        <w:tc>
+          <w:tcPr>
+            <w:tcW w:w="3250" w:type="dxa"/>
+            <w:tcBorders>
+              <w:bottom w:val="single" w:sz="4" w:space="0" w:color="auto"/>
+            </w:tcBorders>
+          </w:tcPr>
+          <w:p>
+            <w:pPr>
+              <w:spacing w:after="160" w:line="360" w:lineRule="auto"/>
+              <w:rPr>
+                <w:rFonts w:ascii="Times New Roman" w:hAnsi="Times New Roman" w:cs="Times New Roman"/>
+              </w:rPr>
+            </w:pPr>
+            <w:r>
+              <w:rPr>
+                <w:rFonts w:ascii="Times New Roman" w:hAnsi="Times New Roman" w:cs="Times New Roman"/>
+              </w:rPr>
+              <w:t>High Predicate and Membership Logic</w:t>
+            </w:r>
+          </w:p>
+        </w:tc>
+        <w:tc>
+          <w:tcPr>
             <w:tcW w:w="2590" w:type="dxa"/>
+            <w:tcBorders>
+              <w:bottom w:val="single" w:sz="4" w:space="0" w:color="auto"/>
+            </w:tcBorders>
           </w:tcPr>
           <w:p>
             <w:pPr>
               <w:spacing w:after="160" w:line="360" w:lineRule="auto"/>
-              <w:jc w:val="both"/>
-              <w:rPr>
-                <w:rFonts w:ascii="Times New Roman" w:hAnsi="Times New Roman" w:cs="Times New Roman"/>
-              </w:rPr>
-            </w:pPr>
-            <w:r>
-              <w:rPr>
-                <w:rFonts w:ascii="Times New Roman" w:hAnsi="Times New Roman" w:cs="Times New Roman"/>
-              </w:rPr>
-              <w:t>16 Attributes</w:t>
-            </w:r>
-          </w:p>
-        </w:tc>
-        <w:tc>
-          <w:tcPr>
-            <w:tcW w:w="2590" w:type="dxa"/>
-          </w:tcPr>
-          <w:p>
-            <w:pPr>
-              <w:spacing w:after="160" w:line="360" w:lineRule="auto"/>
-              <w:jc w:val="both"/>
-              <w:rPr>
-                <w:rFonts w:ascii="Times New Roman" w:hAnsi="Times New Roman" w:cs="Times New Roman"/>
-              </w:rPr>
-            </w:pPr>
-            <w:r>
-              <w:rPr>
-                <w:rFonts w:ascii="Times New Roman" w:hAnsi="Times New Roman" w:cs="Times New Roman"/>
-              </w:rPr>
-              <w:t>High Predicate and Membership Logic</w:t>
-            </w:r>
-          </w:p>
-        </w:tc>
-        <w:tc>
-          <w:tcPr>
-            <w:tcW w:w="2590" w:type="dxa"/>
-          </w:tcPr>
-          <w:p>
-            <w:pPr>
-              <w:spacing w:after="160" w:line="360" w:lineRule="auto"/>
-              <w:jc w:val="both"/>
               <w:rPr>
                 <w:rFonts w:ascii="Times New Roman" w:hAnsi="Times New Roman" w:cs="Times New Roman"/>
               </w:rPr>
@@ -9057,15 +9484,6 @@
         </w:tc>
       </w:tr>
     </w:tbl>
-    <w:p>
-      <w:pPr>
-        <w:spacing w:line="360" w:lineRule="auto"/>
-        <w:jc w:val="both"/>
-        <w:rPr>
-          <w:rFonts w:ascii="Times New Roman" w:hAnsi="Times New Roman" w:cs="Times New Roman"/>
-        </w:rPr>
-      </w:pPr>
-    </w:p>
     <w:p>
       <w:pPr>
         <w:spacing w:line="360" w:lineRule="auto"/>
@@ -9080,6 +9498,12 @@
           <w:docGrid w:linePitch="360"/>
         </w:sectPr>
       </w:pPr>
+      <w:r>
+        <w:rPr>
+          <w:rFonts w:ascii="Times New Roman" w:hAnsi="Times New Roman" w:cs="Times New Roman"/>
+        </w:rPr>
+        <w:t>Source: field study (2026)</w:t>
+      </w:r>
     </w:p>
     <w:p>
       <w:pPr>
@@ -9202,7 +9626,7 @@
         <w:rPr>
           <w:rFonts w:ascii="Times New Roman" w:hAnsi="Times New Roman" w:cs="Times New Roman"/>
         </w:rPr>
-        <w:t xml:space="preserve">// Minimal Verifier Contract Interface </w:t>
+        <w:t xml:space="preserve">//Minimal Verifier Contract Interface </w:t>
       </w:r>
     </w:p>
     <w:p>
@@ -9532,19 +9956,99 @@
         <w:rPr>
           <w:rFonts w:ascii="Times New Roman" w:hAnsi="Times New Roman" w:cs="Times New Roman"/>
         </w:rPr>
-        <w:t>Every experimental run output</w:t>
-      </w:r>
-      <w:r>
-        <w:rPr>
-          <w:rFonts w:ascii="Times New Roman" w:hAnsi="Times New Roman" w:cs="Times New Roman"/>
-        </w:rPr>
-        <w:t>s</w:t>
-      </w:r>
-      <w:r>
-        <w:rPr>
-          <w:rFonts w:ascii="Times New Roman" w:hAnsi="Times New Roman" w:cs="Times New Roman"/>
-        </w:rPr>
-        <w:t xml:space="preserve"> a structured JSON/CSV dataset matching the following schema:</w:t>
+        <w:t>Every experimental run output a structured JSON/CSV dataset matching the following schema:</w:t>
+      </w:r>
+    </w:p>
+    <w:p>
+      <w:pPr>
+        <w:pStyle w:val="Caption"/>
+        <w:keepNext/>
+        <w:rPr>
+          <w:rFonts w:ascii="Times New Roman" w:hAnsi="Times New Roman" w:cs="Times New Roman"/>
+          <w:b/>
+          <w:bCs/>
+          <w:color w:val="auto"/>
+          <w:sz w:val="24"/>
+          <w:szCs w:val="24"/>
+        </w:rPr>
+      </w:pPr>
+      <w:r>
+        <w:rPr>
+          <w:rFonts w:ascii="Times New Roman" w:hAnsi="Times New Roman" w:cs="Times New Roman"/>
+          <w:b/>
+          <w:bCs/>
+          <w:color w:val="auto"/>
+          <w:sz w:val="24"/>
+          <w:szCs w:val="24"/>
+        </w:rPr>
+        <w:t xml:space="preserve">Table </w:t>
+      </w:r>
+      <w:r>
+        <w:rPr>
+          <w:rFonts w:ascii="Times New Roman" w:hAnsi="Times New Roman" w:cs="Times New Roman"/>
+          <w:b/>
+          <w:bCs/>
+          <w:color w:val="auto"/>
+          <w:sz w:val="24"/>
+          <w:szCs w:val="24"/>
+        </w:rPr>
+        <w:fldChar w:fldCharType="begin"/>
+      </w:r>
+      <w:r>
+        <w:rPr>
+          <w:rFonts w:ascii="Times New Roman" w:hAnsi="Times New Roman" w:cs="Times New Roman"/>
+          <w:b/>
+          <w:bCs/>
+          <w:color w:val="auto"/>
+          <w:sz w:val="24"/>
+          <w:szCs w:val="24"/>
+        </w:rPr>
+        <w:instrText xml:space="preserve"> SEQ Table \* ARABIC </w:instrText>
+      </w:r>
+      <w:r>
+        <w:rPr>
+          <w:rFonts w:ascii="Times New Roman" w:hAnsi="Times New Roman" w:cs="Times New Roman"/>
+          <w:b/>
+          <w:bCs/>
+          <w:color w:val="auto"/>
+          <w:sz w:val="24"/>
+          <w:szCs w:val="24"/>
+        </w:rPr>
+        <w:fldChar w:fldCharType="separate"/>
+      </w:r>
+      <w:r>
+        <w:rPr>
+          <w:rFonts w:ascii="Times New Roman" w:hAnsi="Times New Roman" w:cs="Times New Roman"/>
+          <w:b/>
+          <w:bCs/>
+          <w:noProof/>
+          <w:color w:val="auto"/>
+          <w:sz w:val="24"/>
+          <w:szCs w:val="24"/>
+        </w:rPr>
+        <w:t>5</w:t>
+      </w:r>
+      <w:r>
+        <w:rPr>
+          <w:rFonts w:ascii="Times New Roman" w:hAnsi="Times New Roman" w:cs="Times New Roman"/>
+          <w:b/>
+          <w:bCs/>
+          <w:color w:val="auto"/>
+          <w:sz w:val="24"/>
+          <w:szCs w:val="24"/>
+        </w:rPr>
+        <w:fldChar w:fldCharType="end"/>
+      </w:r>
+      <w:r>
+        <w:rPr>
+          <w:rFonts w:ascii="Times New Roman" w:hAnsi="Times New Roman" w:cs="Times New Roman"/>
+          <w:b/>
+          <w:bCs/>
+          <w:color w:val="auto"/>
+          <w:sz w:val="24"/>
+          <w:szCs w:val="24"/>
+        </w:rPr>
+        <w:t>: Data Schema</w:t>
       </w:r>
     </w:p>
     <w:tbl>
@@ -9570,6 +10074,9 @@
         <w:tc>
           <w:tcPr>
             <w:tcW w:w="0" w:type="auto"/>
+            <w:tcBorders>
+              <w:top w:val="single" w:sz="4" w:space="0" w:color="auto"/>
+            </w:tcBorders>
             <w:tcMar>
               <w:top w:w="120" w:type="dxa"/>
               <w:left w:w="180" w:type="dxa"/>
@@ -9594,6 +10101,199 @@
                 <w:bCs/>
               </w:rPr>
               <w:t>Field Name</w:t>
+            </w:r>
+          </w:p>
+        </w:tc>
+        <w:tc>
+          <w:tcPr>
+            <w:tcW w:w="1572" w:type="dxa"/>
+            <w:tcBorders>
+              <w:top w:val="single" w:sz="4" w:space="0" w:color="auto"/>
+            </w:tcBorders>
+            <w:tcMar>
+              <w:top w:w="120" w:type="dxa"/>
+              <w:left w:w="180" w:type="dxa"/>
+              <w:bottom w:w="120" w:type="dxa"/>
+              <w:right w:w="180" w:type="dxa"/>
+            </w:tcMar>
+            <w:vAlign w:val="center"/>
+            <w:hideMark/>
+          </w:tcPr>
+          <w:p>
+            <w:pPr>
+              <w:spacing w:after="0" w:line="360" w:lineRule="auto"/>
+              <w:jc w:val="both"/>
+              <w:rPr>
+                <w:rFonts w:ascii="Times New Roman" w:hAnsi="Times New Roman" w:cs="Times New Roman"/>
+              </w:rPr>
+            </w:pPr>
+            <w:r>
+              <w:rPr>
+                <w:rFonts w:ascii="Times New Roman" w:hAnsi="Times New Roman" w:cs="Times New Roman"/>
+                <w:b/>
+                <w:bCs/>
+              </w:rPr>
+              <w:t>Data Type</w:t>
+            </w:r>
+          </w:p>
+        </w:tc>
+        <w:tc>
+          <w:tcPr>
+            <w:tcW w:w="5519" w:type="dxa"/>
+            <w:tcBorders>
+              <w:top w:val="single" w:sz="4" w:space="0" w:color="auto"/>
+            </w:tcBorders>
+            <w:tcMar>
+              <w:top w:w="120" w:type="dxa"/>
+              <w:left w:w="180" w:type="dxa"/>
+              <w:bottom w:w="120" w:type="dxa"/>
+              <w:right w:w="180" w:type="dxa"/>
+            </w:tcMar>
+            <w:vAlign w:val="center"/>
+            <w:hideMark/>
+          </w:tcPr>
+          <w:p>
+            <w:pPr>
+              <w:spacing w:after="0" w:line="360" w:lineRule="auto"/>
+              <w:jc w:val="both"/>
+              <w:rPr>
+                <w:rFonts w:ascii="Times New Roman" w:hAnsi="Times New Roman" w:cs="Times New Roman"/>
+              </w:rPr>
+            </w:pPr>
+            <w:r>
+              <w:rPr>
+                <w:rFonts w:ascii="Times New Roman" w:hAnsi="Times New Roman" w:cs="Times New Roman"/>
+                <w:b/>
+                <w:bCs/>
+              </w:rPr>
+              <w:t>Description</w:t>
+            </w:r>
+          </w:p>
+        </w:tc>
+      </w:tr>
+      <w:tr>
+        <w:trPr>
+          <w:tblCellSpacing w:w="15" w:type="dxa"/>
+        </w:trPr>
+        <w:tc>
+          <w:tcPr>
+            <w:tcW w:w="0" w:type="auto"/>
+            <w:tcBorders>
+              <w:top w:val="single" w:sz="4" w:space="0" w:color="auto"/>
+            </w:tcBorders>
+            <w:tcMar>
+              <w:top w:w="120" w:type="dxa"/>
+              <w:left w:w="180" w:type="dxa"/>
+              <w:bottom w:w="120" w:type="dxa"/>
+              <w:right w:w="180" w:type="dxa"/>
+            </w:tcMar>
+            <w:vAlign w:val="center"/>
+            <w:hideMark/>
+          </w:tcPr>
+          <w:p>
+            <w:pPr>
+              <w:spacing w:after="0" w:line="360" w:lineRule="auto"/>
+              <w:rPr>
+                <w:rFonts w:ascii="Times New Roman" w:hAnsi="Times New Roman" w:cs="Times New Roman"/>
+              </w:rPr>
+            </w:pPr>
+            <w:r>
+              <w:rPr>
+                <w:rFonts w:ascii="Times New Roman" w:hAnsi="Times New Roman" w:cs="Times New Roman"/>
+              </w:rPr>
+              <w:t>experiment_id</w:t>
+            </w:r>
+          </w:p>
+        </w:tc>
+        <w:tc>
+          <w:tcPr>
+            <w:tcW w:w="1572" w:type="dxa"/>
+            <w:tcBorders>
+              <w:top w:val="single" w:sz="4" w:space="0" w:color="auto"/>
+            </w:tcBorders>
+            <w:tcMar>
+              <w:top w:w="120" w:type="dxa"/>
+              <w:left w:w="180" w:type="dxa"/>
+              <w:bottom w:w="120" w:type="dxa"/>
+              <w:right w:w="180" w:type="dxa"/>
+            </w:tcMar>
+            <w:vAlign w:val="center"/>
+            <w:hideMark/>
+          </w:tcPr>
+          <w:p>
+            <w:pPr>
+              <w:spacing w:after="0" w:line="360" w:lineRule="auto"/>
+              <w:rPr>
+                <w:rFonts w:ascii="Times New Roman" w:hAnsi="Times New Roman" w:cs="Times New Roman"/>
+              </w:rPr>
+            </w:pPr>
+            <w:r>
+              <w:rPr>
+                <w:rFonts w:ascii="Times New Roman" w:hAnsi="Times New Roman" w:cs="Times New Roman"/>
+              </w:rPr>
+              <w:t>String</w:t>
+            </w:r>
+          </w:p>
+        </w:tc>
+        <w:tc>
+          <w:tcPr>
+            <w:tcW w:w="5519" w:type="dxa"/>
+            <w:tcBorders>
+              <w:top w:val="single" w:sz="4" w:space="0" w:color="auto"/>
+            </w:tcBorders>
+            <w:tcMar>
+              <w:top w:w="120" w:type="dxa"/>
+              <w:left w:w="180" w:type="dxa"/>
+              <w:bottom w:w="120" w:type="dxa"/>
+              <w:right w:w="180" w:type="dxa"/>
+            </w:tcMar>
+            <w:vAlign w:val="center"/>
+            <w:hideMark/>
+          </w:tcPr>
+          <w:p>
+            <w:pPr>
+              <w:spacing w:after="0" w:line="360" w:lineRule="auto"/>
+              <w:rPr>
+                <w:rFonts w:ascii="Times New Roman" w:hAnsi="Times New Roman" w:cs="Times New Roman"/>
+              </w:rPr>
+            </w:pPr>
+            <w:r>
+              <w:rPr>
+                <w:rFonts w:ascii="Times New Roman" w:hAnsi="Times New Roman" w:cs="Times New Roman"/>
+              </w:rPr>
+              <w:t>Unique identifier for the experiment run</w:t>
+            </w:r>
+          </w:p>
+        </w:tc>
+      </w:tr>
+      <w:tr>
+        <w:trPr>
+          <w:tblCellSpacing w:w="15" w:type="dxa"/>
+        </w:trPr>
+        <w:tc>
+          <w:tcPr>
+            <w:tcW w:w="0" w:type="auto"/>
+            <w:tcMar>
+              <w:top w:w="120" w:type="dxa"/>
+              <w:left w:w="180" w:type="dxa"/>
+              <w:bottom w:w="120" w:type="dxa"/>
+              <w:right w:w="180" w:type="dxa"/>
+            </w:tcMar>
+            <w:vAlign w:val="center"/>
+            <w:hideMark/>
+          </w:tcPr>
+          <w:p>
+            <w:pPr>
+              <w:spacing w:after="0" w:line="360" w:lineRule="auto"/>
+              <w:rPr>
+                <w:rFonts w:ascii="Times New Roman" w:hAnsi="Times New Roman" w:cs="Times New Roman"/>
+              </w:rPr>
+            </w:pPr>
+            <w:r>
+              <w:rPr>
+                <w:rFonts w:ascii="Times New Roman" w:hAnsi="Times New Roman" w:cs="Times New Roman"/>
+              </w:rPr>
+              <w:t>scenario_id</w:t>
             </w:r>
           </w:p>
         </w:tc>
@@ -9612,18 +10312,15 @@
           <w:p>
             <w:pPr>
               <w:spacing w:after="0" w:line="360" w:lineRule="auto"/>
-              <w:jc w:val="both"/>
-              <w:rPr>
-                <w:rFonts w:ascii="Times New Roman" w:hAnsi="Times New Roman" w:cs="Times New Roman"/>
-              </w:rPr>
-            </w:pPr>
-            <w:r>
-              <w:rPr>
-                <w:rFonts w:ascii="Times New Roman" w:hAnsi="Times New Roman" w:cs="Times New Roman"/>
-                <w:b/>
-                <w:bCs/>
-              </w:rPr>
-              <w:t>Data Type</w:t>
+              <w:rPr>
+                <w:rFonts w:ascii="Times New Roman" w:hAnsi="Times New Roman" w:cs="Times New Roman"/>
+              </w:rPr>
+            </w:pPr>
+            <w:r>
+              <w:rPr>
+                <w:rFonts w:ascii="Times New Roman" w:hAnsi="Times New Roman" w:cs="Times New Roman"/>
+              </w:rPr>
+              <w:t>String</w:t>
             </w:r>
           </w:p>
         </w:tc>
@@ -9642,18 +10339,15 @@
           <w:p>
             <w:pPr>
               <w:spacing w:after="0" w:line="360" w:lineRule="auto"/>
-              <w:jc w:val="both"/>
-              <w:rPr>
-                <w:rFonts w:ascii="Times New Roman" w:hAnsi="Times New Roman" w:cs="Times New Roman"/>
-              </w:rPr>
-            </w:pPr>
-            <w:r>
-              <w:rPr>
-                <w:rFonts w:ascii="Times New Roman" w:hAnsi="Times New Roman" w:cs="Times New Roman"/>
-                <w:b/>
-                <w:bCs/>
-              </w:rPr>
-              <w:t>Description</w:t>
+              <w:rPr>
+                <w:rFonts w:ascii="Times New Roman" w:hAnsi="Times New Roman" w:cs="Times New Roman"/>
+              </w:rPr>
+            </w:pPr>
+            <w:r>
+              <w:rPr>
+                <w:rFonts w:ascii="Times New Roman" w:hAnsi="Times New Roman" w:cs="Times New Roman"/>
+              </w:rPr>
+              <w:t>Benchmark scenario designation (Scenario 1 to Scenario 4)</w:t>
             </w:r>
           </w:p>
         </w:tc>
@@ -9677,16 +10371,15 @@
           <w:p>
             <w:pPr>
               <w:spacing w:after="0" w:line="360" w:lineRule="auto"/>
-              <w:jc w:val="both"/>
-              <w:rPr>
-                <w:rFonts w:ascii="Times New Roman" w:hAnsi="Times New Roman" w:cs="Times New Roman"/>
-              </w:rPr>
-            </w:pPr>
-            <w:r>
-              <w:rPr>
-                <w:rFonts w:ascii="Times New Roman" w:hAnsi="Times New Roman" w:cs="Times New Roman"/>
-              </w:rPr>
-              <w:t>experiment_id</w:t>
+              <w:rPr>
+                <w:rFonts w:ascii="Times New Roman" w:hAnsi="Times New Roman" w:cs="Times New Roman"/>
+              </w:rPr>
+            </w:pPr>
+            <w:r>
+              <w:rPr>
+                <w:rFonts w:ascii="Times New Roman" w:hAnsi="Times New Roman" w:cs="Times New Roman"/>
+              </w:rPr>
+              <w:t>run_id</w:t>
             </w:r>
           </w:p>
         </w:tc>
@@ -9705,16 +10398,15 @@
           <w:p>
             <w:pPr>
               <w:spacing w:after="0" w:line="360" w:lineRule="auto"/>
-              <w:jc w:val="both"/>
-              <w:rPr>
-                <w:rFonts w:ascii="Times New Roman" w:hAnsi="Times New Roman" w:cs="Times New Roman"/>
-              </w:rPr>
-            </w:pPr>
-            <w:r>
-              <w:rPr>
-                <w:rFonts w:ascii="Times New Roman" w:hAnsi="Times New Roman" w:cs="Times New Roman"/>
-              </w:rPr>
-              <w:t>String</w:t>
+              <w:rPr>
+                <w:rFonts w:ascii="Times New Roman" w:hAnsi="Times New Roman" w:cs="Times New Roman"/>
+              </w:rPr>
+            </w:pPr>
+            <w:r>
+              <w:rPr>
+                <w:rFonts w:ascii="Times New Roman" w:hAnsi="Times New Roman" w:cs="Times New Roman"/>
+              </w:rPr>
+              <w:t>Integer</w:t>
             </w:r>
           </w:p>
         </w:tc>
@@ -9733,16 +10425,43 @@
           <w:p>
             <w:pPr>
               <w:spacing w:after="0" w:line="360" w:lineRule="auto"/>
-              <w:jc w:val="both"/>
-              <w:rPr>
-                <w:rFonts w:ascii="Times New Roman" w:hAnsi="Times New Roman" w:cs="Times New Roman"/>
-              </w:rPr>
-            </w:pPr>
-            <w:r>
-              <w:rPr>
-                <w:rFonts w:ascii="Times New Roman" w:hAnsi="Times New Roman" w:cs="Times New Roman"/>
-              </w:rPr>
-              <w:t>Unique identifier for the experiment run</w:t>
+              <w:rPr>
+                <w:rFonts w:ascii="Times New Roman" w:hAnsi="Times New Roman" w:cs="Times New Roman"/>
+              </w:rPr>
+            </w:pPr>
+            <w:r>
+              <w:rPr>
+                <w:rFonts w:ascii="Times New Roman" w:hAnsi="Times New Roman" w:cs="Times New Roman"/>
+              </w:rPr>
+              <w:t>Repetition trial number (</w:t>
+            </w:r>
+            <m:oMath>
+              <m:r>
+                <w:rPr>
+                  <w:rFonts w:ascii="Cambria Math" w:hAnsi="Cambria Math" w:cs="Times New Roman"/>
+                </w:rPr>
+                <m:t>1</m:t>
+              </m:r>
+            </m:oMath>
+            <w:r>
+              <w:rPr>
+                <w:rFonts w:ascii="Times New Roman" w:hAnsi="Times New Roman" w:cs="Times New Roman"/>
+              </w:rPr>
+              <w:t xml:space="preserve"> to </w:t>
+            </w:r>
+            <m:oMath>
+              <m:r>
+                <w:rPr>
+                  <w:rFonts w:ascii="Cambria Math" w:hAnsi="Cambria Math" w:cs="Times New Roman"/>
+                </w:rPr>
+                <m:t>N</m:t>
+              </m:r>
+            </m:oMath>
+            <w:r>
+              <w:rPr>
+                <w:rFonts w:ascii="Times New Roman" w:hAnsi="Times New Roman" w:cs="Times New Roman"/>
+              </w:rPr>
+              <w:t>)</w:t>
             </w:r>
           </w:p>
         </w:tc>
@@ -9766,16 +10485,16 @@
           <w:p>
             <w:pPr>
               <w:spacing w:after="0" w:line="360" w:lineRule="auto"/>
-              <w:jc w:val="both"/>
-              <w:rPr>
-                <w:rFonts w:ascii="Times New Roman" w:hAnsi="Times New Roman" w:cs="Times New Roman"/>
-              </w:rPr>
-            </w:pPr>
-            <w:r>
-              <w:rPr>
-                <w:rFonts w:ascii="Times New Roman" w:hAnsi="Times New Roman" w:cs="Times New Roman"/>
-              </w:rPr>
-              <w:t>scenario_id</w:t>
+              <w:rPr>
+                <w:rFonts w:ascii="Times New Roman" w:hAnsi="Times New Roman" w:cs="Times New Roman"/>
+              </w:rPr>
+            </w:pPr>
+            <w:r>
+              <w:rPr>
+                <w:rFonts w:ascii="Times New Roman" w:hAnsi="Times New Roman" w:cs="Times New Roman"/>
+              </w:rPr>
+              <w:lastRenderedPageBreak/>
+              <w:t>attribute_count</w:t>
             </w:r>
           </w:p>
         </w:tc>
@@ -9794,16 +10513,15 @@
           <w:p>
             <w:pPr>
               <w:spacing w:after="0" w:line="360" w:lineRule="auto"/>
-              <w:jc w:val="both"/>
-              <w:rPr>
-                <w:rFonts w:ascii="Times New Roman" w:hAnsi="Times New Roman" w:cs="Times New Roman"/>
-              </w:rPr>
-            </w:pPr>
-            <w:r>
-              <w:rPr>
-                <w:rFonts w:ascii="Times New Roman" w:hAnsi="Times New Roman" w:cs="Times New Roman"/>
-              </w:rPr>
-              <w:t>String</w:t>
+              <w:rPr>
+                <w:rFonts w:ascii="Times New Roman" w:hAnsi="Times New Roman" w:cs="Times New Roman"/>
+              </w:rPr>
+            </w:pPr>
+            <w:r>
+              <w:rPr>
+                <w:rFonts w:ascii="Times New Roman" w:hAnsi="Times New Roman" w:cs="Times New Roman"/>
+              </w:rPr>
+              <w:t>Integer</w:t>
             </w:r>
           </w:p>
         </w:tc>
@@ -9822,16 +10540,15 @@
           <w:p>
             <w:pPr>
               <w:spacing w:after="0" w:line="360" w:lineRule="auto"/>
-              <w:jc w:val="both"/>
-              <w:rPr>
-                <w:rFonts w:ascii="Times New Roman" w:hAnsi="Times New Roman" w:cs="Times New Roman"/>
-              </w:rPr>
-            </w:pPr>
-            <w:r>
-              <w:rPr>
-                <w:rFonts w:ascii="Times New Roman" w:hAnsi="Times New Roman" w:cs="Times New Roman"/>
-              </w:rPr>
-              <w:t>Benchmark scenario designation (Scenario 1 to Scenario 4)</w:t>
+              <w:rPr>
+                <w:rFonts w:ascii="Times New Roman" w:hAnsi="Times New Roman" w:cs="Times New Roman"/>
+              </w:rPr>
+            </w:pPr>
+            <w:r>
+              <w:rPr>
+                <w:rFonts w:ascii="Times New Roman" w:hAnsi="Times New Roman" w:cs="Times New Roman"/>
+              </w:rPr>
+              <w:t>Number of attributes evaluated in the credential vector</w:t>
             </w:r>
           </w:p>
         </w:tc>
@@ -9855,16 +10572,15 @@
           <w:p>
             <w:pPr>
               <w:spacing w:after="0" w:line="360" w:lineRule="auto"/>
-              <w:jc w:val="both"/>
-              <w:rPr>
-                <w:rFonts w:ascii="Times New Roman" w:hAnsi="Times New Roman" w:cs="Times New Roman"/>
-              </w:rPr>
-            </w:pPr>
-            <w:r>
-              <w:rPr>
-                <w:rFonts w:ascii="Times New Roman" w:hAnsi="Times New Roman" w:cs="Times New Roman"/>
-              </w:rPr>
-              <w:t>run_id</w:t>
+              <w:rPr>
+                <w:rFonts w:ascii="Times New Roman" w:hAnsi="Times New Roman" w:cs="Times New Roman"/>
+              </w:rPr>
+            </w:pPr>
+            <w:r>
+              <w:rPr>
+                <w:rFonts w:ascii="Times New Roman" w:hAnsi="Times New Roman" w:cs="Times New Roman"/>
+              </w:rPr>
+              <w:t>predicate_level</w:t>
             </w:r>
           </w:p>
         </w:tc>
@@ -9883,16 +10599,15 @@
           <w:p>
             <w:pPr>
               <w:spacing w:after="0" w:line="360" w:lineRule="auto"/>
-              <w:jc w:val="both"/>
-              <w:rPr>
-                <w:rFonts w:ascii="Times New Roman" w:hAnsi="Times New Roman" w:cs="Times New Roman"/>
-              </w:rPr>
-            </w:pPr>
-            <w:r>
-              <w:rPr>
-                <w:rFonts w:ascii="Times New Roman" w:hAnsi="Times New Roman" w:cs="Times New Roman"/>
-              </w:rPr>
-              <w:t>Integer</w:t>
+              <w:rPr>
+                <w:rFonts w:ascii="Times New Roman" w:hAnsi="Times New Roman" w:cs="Times New Roman"/>
+              </w:rPr>
+            </w:pPr>
+            <w:r>
+              <w:rPr>
+                <w:rFonts w:ascii="Times New Roman" w:hAnsi="Times New Roman" w:cs="Times New Roman"/>
+              </w:rPr>
+              <w:t>String</w:t>
             </w:r>
           </w:p>
         </w:tc>
@@ -9911,44 +10626,15 @@
           <w:p>
             <w:pPr>
               <w:spacing w:after="0" w:line="360" w:lineRule="auto"/>
-              <w:jc w:val="both"/>
-              <w:rPr>
-                <w:rFonts w:ascii="Times New Roman" w:hAnsi="Times New Roman" w:cs="Times New Roman"/>
-              </w:rPr>
-            </w:pPr>
-            <w:r>
-              <w:rPr>
-                <w:rFonts w:ascii="Times New Roman" w:hAnsi="Times New Roman" w:cs="Times New Roman"/>
-              </w:rPr>
-              <w:t>Repetition trial number (</w:t>
-            </w:r>
-            <m:oMath>
-              <m:r>
-                <w:rPr>
-                  <w:rFonts w:ascii="Cambria Math" w:hAnsi="Cambria Math" w:cs="Times New Roman"/>
-                </w:rPr>
-                <m:t>1</m:t>
-              </m:r>
-            </m:oMath>
-            <w:r>
-              <w:rPr>
-                <w:rFonts w:ascii="Times New Roman" w:hAnsi="Times New Roman" w:cs="Times New Roman"/>
-              </w:rPr>
-              <w:t xml:space="preserve"> to </w:t>
-            </w:r>
-            <m:oMath>
-              <m:r>
-                <w:rPr>
-                  <w:rFonts w:ascii="Cambria Math" w:hAnsi="Cambria Math" w:cs="Times New Roman"/>
-                </w:rPr>
-                <m:t>N</m:t>
-              </m:r>
-            </m:oMath>
-            <w:r>
-              <w:rPr>
-                <w:rFonts w:ascii="Times New Roman" w:hAnsi="Times New Roman" w:cs="Times New Roman"/>
-              </w:rPr>
-              <w:t>)</w:t>
+              <w:rPr>
+                <w:rFonts w:ascii="Times New Roman" w:hAnsi="Times New Roman" w:cs="Times New Roman"/>
+              </w:rPr>
+            </w:pPr>
+            <w:r>
+              <w:rPr>
+                <w:rFonts w:ascii="Times New Roman" w:hAnsi="Times New Roman" w:cs="Times New Roman"/>
+              </w:rPr>
+              <w:t>Level of predicate complexity implemented</w:t>
             </w:r>
           </w:p>
         </w:tc>
@@ -9972,16 +10658,15 @@
           <w:p>
             <w:pPr>
               <w:spacing w:after="0" w:line="360" w:lineRule="auto"/>
-              <w:jc w:val="both"/>
-              <w:rPr>
-                <w:rFonts w:ascii="Times New Roman" w:hAnsi="Times New Roman" w:cs="Times New Roman"/>
-              </w:rPr>
-            </w:pPr>
-            <w:r>
-              <w:rPr>
-                <w:rFonts w:ascii="Times New Roman" w:hAnsi="Times New Roman" w:cs="Times New Roman"/>
-              </w:rPr>
-              <w:t>attribute_count</w:t>
+              <w:rPr>
+                <w:rFonts w:ascii="Times New Roman" w:hAnsi="Times New Roman" w:cs="Times New Roman"/>
+              </w:rPr>
+            </w:pPr>
+            <w:r>
+              <w:rPr>
+                <w:rFonts w:ascii="Times New Roman" w:hAnsi="Times New Roman" w:cs="Times New Roman"/>
+              </w:rPr>
+              <w:t>circuit_size</w:t>
             </w:r>
           </w:p>
         </w:tc>
@@ -10000,7 +10685,6 @@
           <w:p>
             <w:pPr>
               <w:spacing w:after="0" w:line="360" w:lineRule="auto"/>
-              <w:jc w:val="both"/>
               <w:rPr>
                 <w:rFonts w:ascii="Times New Roman" w:hAnsi="Times New Roman" w:cs="Times New Roman"/>
               </w:rPr>
@@ -10028,16 +10712,15 @@
           <w:p>
             <w:pPr>
               <w:spacing w:after="0" w:line="360" w:lineRule="auto"/>
-              <w:jc w:val="both"/>
-              <w:rPr>
-                <w:rFonts w:ascii="Times New Roman" w:hAnsi="Times New Roman" w:cs="Times New Roman"/>
-              </w:rPr>
-            </w:pPr>
-            <w:r>
-              <w:rPr>
-                <w:rFonts w:ascii="Times New Roman" w:hAnsi="Times New Roman" w:cs="Times New Roman"/>
-              </w:rPr>
-              <w:t>Number of attributes evaluated in the credential vector</w:t>
+              <w:rPr>
+                <w:rFonts w:ascii="Times New Roman" w:hAnsi="Times New Roman" w:cs="Times New Roman"/>
+              </w:rPr>
+            </w:pPr>
+            <w:r>
+              <w:rPr>
+                <w:rFonts w:ascii="Times New Roman" w:hAnsi="Times New Roman" w:cs="Times New Roman"/>
+              </w:rPr>
+              <w:t>Total gates/constraints in the compiled circuit</w:t>
             </w:r>
           </w:p>
         </w:tc>
@@ -10061,17 +10744,15 @@
           <w:p>
             <w:pPr>
               <w:spacing w:after="0" w:line="360" w:lineRule="auto"/>
-              <w:jc w:val="both"/>
-              <w:rPr>
-                <w:rFonts w:ascii="Times New Roman" w:hAnsi="Times New Roman" w:cs="Times New Roman"/>
-              </w:rPr>
-            </w:pPr>
-            <w:r>
-              <w:rPr>
-                <w:rFonts w:ascii="Times New Roman" w:hAnsi="Times New Roman" w:cs="Times New Roman"/>
-              </w:rPr>
-              <w:lastRenderedPageBreak/>
-              <w:t>predicate_level</w:t>
+              <w:rPr>
+                <w:rFonts w:ascii="Times New Roman" w:hAnsi="Times New Roman" w:cs="Times New Roman"/>
+              </w:rPr>
+            </w:pPr>
+            <w:r>
+              <w:rPr>
+                <w:rFonts w:ascii="Times New Roman" w:hAnsi="Times New Roman" w:cs="Times New Roman"/>
+              </w:rPr>
+              <w:t>compile_time</w:t>
             </w:r>
           </w:p>
         </w:tc>
@@ -10090,16 +10771,15 @@
           <w:p>
             <w:pPr>
               <w:spacing w:after="0" w:line="360" w:lineRule="auto"/>
-              <w:jc w:val="both"/>
-              <w:rPr>
-                <w:rFonts w:ascii="Times New Roman" w:hAnsi="Times New Roman" w:cs="Times New Roman"/>
-              </w:rPr>
-            </w:pPr>
-            <w:r>
-              <w:rPr>
-                <w:rFonts w:ascii="Times New Roman" w:hAnsi="Times New Roman" w:cs="Times New Roman"/>
-              </w:rPr>
-              <w:t>String</w:t>
+              <w:rPr>
+                <w:rFonts w:ascii="Times New Roman" w:hAnsi="Times New Roman" w:cs="Times New Roman"/>
+              </w:rPr>
+            </w:pPr>
+            <w:r>
+              <w:rPr>
+                <w:rFonts w:ascii="Times New Roman" w:hAnsi="Times New Roman" w:cs="Times New Roman"/>
+              </w:rPr>
+              <w:t>Float</w:t>
             </w:r>
           </w:p>
         </w:tc>
@@ -10118,185 +10798,6 @@
           <w:p>
             <w:pPr>
               <w:spacing w:after="0" w:line="360" w:lineRule="auto"/>
-              <w:jc w:val="both"/>
-              <w:rPr>
-                <w:rFonts w:ascii="Times New Roman" w:hAnsi="Times New Roman" w:cs="Times New Roman"/>
-              </w:rPr>
-            </w:pPr>
-            <w:r>
-              <w:rPr>
-                <w:rFonts w:ascii="Times New Roman" w:hAnsi="Times New Roman" w:cs="Times New Roman"/>
-              </w:rPr>
-              <w:t>Level of predicate complexity implemented</w:t>
-            </w:r>
-          </w:p>
-        </w:tc>
-      </w:tr>
-      <w:tr>
-        <w:trPr>
-          <w:tblCellSpacing w:w="15" w:type="dxa"/>
-        </w:trPr>
-        <w:tc>
-          <w:tcPr>
-            <w:tcW w:w="0" w:type="auto"/>
-            <w:tcMar>
-              <w:top w:w="120" w:type="dxa"/>
-              <w:left w:w="180" w:type="dxa"/>
-              <w:bottom w:w="120" w:type="dxa"/>
-              <w:right w:w="180" w:type="dxa"/>
-            </w:tcMar>
-            <w:vAlign w:val="center"/>
-            <w:hideMark/>
-          </w:tcPr>
-          <w:p>
-            <w:pPr>
-              <w:spacing w:after="0" w:line="360" w:lineRule="auto"/>
-              <w:jc w:val="both"/>
-              <w:rPr>
-                <w:rFonts w:ascii="Times New Roman" w:hAnsi="Times New Roman" w:cs="Times New Roman"/>
-              </w:rPr>
-            </w:pPr>
-            <w:r>
-              <w:rPr>
-                <w:rFonts w:ascii="Times New Roman" w:hAnsi="Times New Roman" w:cs="Times New Roman"/>
-              </w:rPr>
-              <w:t>circuit_size</w:t>
-            </w:r>
-          </w:p>
-        </w:tc>
-        <w:tc>
-          <w:tcPr>
-            <w:tcW w:w="1572" w:type="dxa"/>
-            <w:tcMar>
-              <w:top w:w="120" w:type="dxa"/>
-              <w:left w:w="180" w:type="dxa"/>
-              <w:bottom w:w="120" w:type="dxa"/>
-              <w:right w:w="180" w:type="dxa"/>
-            </w:tcMar>
-            <w:vAlign w:val="center"/>
-            <w:hideMark/>
-          </w:tcPr>
-          <w:p>
-            <w:pPr>
-              <w:spacing w:after="0" w:line="360" w:lineRule="auto"/>
-              <w:jc w:val="both"/>
-              <w:rPr>
-                <w:rFonts w:ascii="Times New Roman" w:hAnsi="Times New Roman" w:cs="Times New Roman"/>
-              </w:rPr>
-            </w:pPr>
-            <w:r>
-              <w:rPr>
-                <w:rFonts w:ascii="Times New Roman" w:hAnsi="Times New Roman" w:cs="Times New Roman"/>
-              </w:rPr>
-              <w:t>Integer</w:t>
-            </w:r>
-          </w:p>
-        </w:tc>
-        <w:tc>
-          <w:tcPr>
-            <w:tcW w:w="5519" w:type="dxa"/>
-            <w:tcMar>
-              <w:top w:w="120" w:type="dxa"/>
-              <w:left w:w="180" w:type="dxa"/>
-              <w:bottom w:w="120" w:type="dxa"/>
-              <w:right w:w="180" w:type="dxa"/>
-            </w:tcMar>
-            <w:vAlign w:val="center"/>
-            <w:hideMark/>
-          </w:tcPr>
-          <w:p>
-            <w:pPr>
-              <w:spacing w:after="0" w:line="360" w:lineRule="auto"/>
-              <w:jc w:val="both"/>
-              <w:rPr>
-                <w:rFonts w:ascii="Times New Roman" w:hAnsi="Times New Roman" w:cs="Times New Roman"/>
-              </w:rPr>
-            </w:pPr>
-            <w:r>
-              <w:rPr>
-                <w:rFonts w:ascii="Times New Roman" w:hAnsi="Times New Roman" w:cs="Times New Roman"/>
-              </w:rPr>
-              <w:t>Total gates/constraints in the compiled circuit</w:t>
-            </w:r>
-          </w:p>
-        </w:tc>
-      </w:tr>
-      <w:tr>
-        <w:trPr>
-          <w:tblCellSpacing w:w="15" w:type="dxa"/>
-        </w:trPr>
-        <w:tc>
-          <w:tcPr>
-            <w:tcW w:w="0" w:type="auto"/>
-            <w:tcMar>
-              <w:top w:w="120" w:type="dxa"/>
-              <w:left w:w="180" w:type="dxa"/>
-              <w:bottom w:w="120" w:type="dxa"/>
-              <w:right w:w="180" w:type="dxa"/>
-            </w:tcMar>
-            <w:vAlign w:val="center"/>
-            <w:hideMark/>
-          </w:tcPr>
-          <w:p>
-            <w:pPr>
-              <w:spacing w:after="0" w:line="360" w:lineRule="auto"/>
-              <w:jc w:val="both"/>
-              <w:rPr>
-                <w:rFonts w:ascii="Times New Roman" w:hAnsi="Times New Roman" w:cs="Times New Roman"/>
-              </w:rPr>
-            </w:pPr>
-            <w:r>
-              <w:rPr>
-                <w:rFonts w:ascii="Times New Roman" w:hAnsi="Times New Roman" w:cs="Times New Roman"/>
-              </w:rPr>
-              <w:t>compile_time</w:t>
-            </w:r>
-          </w:p>
-        </w:tc>
-        <w:tc>
-          <w:tcPr>
-            <w:tcW w:w="1572" w:type="dxa"/>
-            <w:tcMar>
-              <w:top w:w="120" w:type="dxa"/>
-              <w:left w:w="180" w:type="dxa"/>
-              <w:bottom w:w="120" w:type="dxa"/>
-              <w:right w:w="180" w:type="dxa"/>
-            </w:tcMar>
-            <w:vAlign w:val="center"/>
-            <w:hideMark/>
-          </w:tcPr>
-          <w:p>
-            <w:pPr>
-              <w:spacing w:after="0" w:line="360" w:lineRule="auto"/>
-              <w:jc w:val="both"/>
-              <w:rPr>
-                <w:rFonts w:ascii="Times New Roman" w:hAnsi="Times New Roman" w:cs="Times New Roman"/>
-              </w:rPr>
-            </w:pPr>
-            <w:r>
-              <w:rPr>
-                <w:rFonts w:ascii="Times New Roman" w:hAnsi="Times New Roman" w:cs="Times New Roman"/>
-              </w:rPr>
-              <w:t>Float</w:t>
-            </w:r>
-          </w:p>
-        </w:tc>
-        <w:tc>
-          <w:tcPr>
-            <w:tcW w:w="5519" w:type="dxa"/>
-            <w:tcMar>
-              <w:top w:w="120" w:type="dxa"/>
-              <w:left w:w="180" w:type="dxa"/>
-              <w:bottom w:w="120" w:type="dxa"/>
-              <w:right w:w="180" w:type="dxa"/>
-            </w:tcMar>
-            <w:vAlign w:val="center"/>
-            <w:hideMark/>
-          </w:tcPr>
-          <w:p>
-            <w:pPr>
-              <w:spacing w:after="0" w:line="360" w:lineRule="auto"/>
-              <w:jc w:val="both"/>
               <w:rPr>
                 <w:rFonts w:ascii="Times New Roman" w:hAnsi="Times New Roman" w:cs="Times New Roman"/>
               </w:rPr>
@@ -10346,7 +10847,6 @@
           <w:p>
             <w:pPr>
               <w:spacing w:after="0" w:line="360" w:lineRule="auto"/>
-              <w:jc w:val="both"/>
               <w:rPr>
                 <w:rFonts w:ascii="Times New Roman" w:hAnsi="Times New Roman" w:cs="Times New Roman"/>
               </w:rPr>
@@ -10374,7 +10874,6 @@
           <w:p>
             <w:pPr>
               <w:spacing w:after="0" w:line="360" w:lineRule="auto"/>
-              <w:jc w:val="both"/>
               <w:rPr>
                 <w:rFonts w:ascii="Times New Roman" w:hAnsi="Times New Roman" w:cs="Times New Roman"/>
               </w:rPr>
@@ -10402,7 +10901,6 @@
           <w:p>
             <w:pPr>
               <w:spacing w:after="0" w:line="360" w:lineRule="auto"/>
-              <w:jc w:val="both"/>
               <w:rPr>
                 <w:rFonts w:ascii="Times New Roman" w:hAnsi="Times New Roman" w:cs="Times New Roman"/>
               </w:rPr>
@@ -10452,7 +10950,6 @@
           <w:p>
             <w:pPr>
               <w:spacing w:after="0" w:line="360" w:lineRule="auto"/>
-              <w:jc w:val="both"/>
               <w:rPr>
                 <w:rFonts w:ascii="Times New Roman" w:hAnsi="Times New Roman" w:cs="Times New Roman"/>
               </w:rPr>
@@ -10480,7 +10977,6 @@
           <w:p>
             <w:pPr>
               <w:spacing w:after="0" w:line="360" w:lineRule="auto"/>
-              <w:jc w:val="both"/>
               <w:rPr>
                 <w:rFonts w:ascii="Times New Roman" w:hAnsi="Times New Roman" w:cs="Times New Roman"/>
               </w:rPr>
@@ -10508,7 +11004,6 @@
           <w:p>
             <w:pPr>
               <w:spacing w:after="0" w:line="360" w:lineRule="auto"/>
-              <w:jc w:val="both"/>
               <w:rPr>
                 <w:rFonts w:ascii="Times New Roman" w:hAnsi="Times New Roman" w:cs="Times New Roman"/>
               </w:rPr>
@@ -10558,7 +11053,6 @@
           <w:p>
             <w:pPr>
               <w:spacing w:after="0" w:line="360" w:lineRule="auto"/>
-              <w:jc w:val="both"/>
               <w:rPr>
                 <w:rFonts w:ascii="Times New Roman" w:hAnsi="Times New Roman" w:cs="Times New Roman"/>
               </w:rPr>
@@ -10586,7 +11080,6 @@
           <w:p>
             <w:pPr>
               <w:spacing w:after="0" w:line="360" w:lineRule="auto"/>
-              <w:jc w:val="both"/>
               <w:rPr>
                 <w:rFonts w:ascii="Times New Roman" w:hAnsi="Times New Roman" w:cs="Times New Roman"/>
               </w:rPr>
@@ -10614,7 +11107,6 @@
           <w:p>
             <w:pPr>
               <w:spacing w:after="0" w:line="360" w:lineRule="auto"/>
-              <w:jc w:val="both"/>
               <w:rPr>
                 <w:rFonts w:ascii="Times New Roman" w:hAnsi="Times New Roman" w:cs="Times New Roman"/>
               </w:rPr>
@@ -10664,7 +11156,6 @@
           <w:p>
             <w:pPr>
               <w:spacing w:after="0" w:line="360" w:lineRule="auto"/>
-              <w:jc w:val="both"/>
               <w:rPr>
                 <w:rFonts w:ascii="Times New Roman" w:hAnsi="Times New Roman" w:cs="Times New Roman"/>
               </w:rPr>
@@ -10692,7 +11183,6 @@
           <w:p>
             <w:pPr>
               <w:spacing w:after="0" w:line="360" w:lineRule="auto"/>
-              <w:jc w:val="both"/>
               <w:rPr>
                 <w:rFonts w:ascii="Times New Roman" w:hAnsi="Times New Roman" w:cs="Times New Roman"/>
               </w:rPr>
@@ -10720,7 +11210,6 @@
           <w:p>
             <w:pPr>
               <w:spacing w:after="0" w:line="360" w:lineRule="auto"/>
-              <w:jc w:val="both"/>
               <w:rPr>
                 <w:rFonts w:ascii="Times New Roman" w:hAnsi="Times New Roman" w:cs="Times New Roman"/>
               </w:rPr>
@@ -10770,7 +11259,6 @@
           <w:p>
             <w:pPr>
               <w:spacing w:after="0" w:line="360" w:lineRule="auto"/>
-              <w:jc w:val="both"/>
               <w:rPr>
                 <w:rFonts w:ascii="Times New Roman" w:hAnsi="Times New Roman" w:cs="Times New Roman"/>
               </w:rPr>
@@ -10798,7 +11286,6 @@
           <w:p>
             <w:pPr>
               <w:spacing w:after="0" w:line="360" w:lineRule="auto"/>
-              <w:jc w:val="both"/>
               <w:rPr>
                 <w:rFonts w:ascii="Times New Roman" w:hAnsi="Times New Roman" w:cs="Times New Roman"/>
               </w:rPr>
@@ -10826,7 +11313,6 @@
           <w:p>
             <w:pPr>
               <w:spacing w:after="0" w:line="360" w:lineRule="auto"/>
-              <w:jc w:val="both"/>
               <w:rPr>
                 <w:rFonts w:ascii="Times New Roman" w:hAnsi="Times New Roman" w:cs="Times New Roman"/>
               </w:rPr>
@@ -10876,7 +11362,6 @@
           <w:p>
             <w:pPr>
               <w:spacing w:after="0" w:line="360" w:lineRule="auto"/>
-              <w:jc w:val="both"/>
               <w:rPr>
                 <w:rFonts w:ascii="Times New Roman" w:hAnsi="Times New Roman" w:cs="Times New Roman"/>
               </w:rPr>
@@ -10904,7 +11389,6 @@
           <w:p>
             <w:pPr>
               <w:spacing w:after="0" w:line="360" w:lineRule="auto"/>
-              <w:jc w:val="both"/>
               <w:rPr>
                 <w:rFonts w:ascii="Times New Roman" w:hAnsi="Times New Roman" w:cs="Times New Roman"/>
               </w:rPr>
@@ -10932,7 +11416,6 @@
           <w:p>
             <w:pPr>
               <w:spacing w:after="0" w:line="360" w:lineRule="auto"/>
-              <w:jc w:val="both"/>
               <w:rPr>
                 <w:rFonts w:ascii="Times New Roman" w:hAnsi="Times New Roman" w:cs="Times New Roman"/>
               </w:rPr>
@@ -10982,7 +11465,6 @@
           <w:p>
             <w:pPr>
               <w:spacing w:after="0" w:line="360" w:lineRule="auto"/>
-              <w:jc w:val="both"/>
               <w:rPr>
                 <w:rFonts w:ascii="Times New Roman" w:hAnsi="Times New Roman" w:cs="Times New Roman"/>
               </w:rPr>
@@ -11010,7 +11492,6 @@
           <w:p>
             <w:pPr>
               <w:spacing w:after="0" w:line="360" w:lineRule="auto"/>
-              <w:jc w:val="both"/>
               <w:rPr>
                 <w:rFonts w:ascii="Times New Roman" w:hAnsi="Times New Roman" w:cs="Times New Roman"/>
               </w:rPr>
@@ -11038,7 +11519,6 @@
           <w:p>
             <w:pPr>
               <w:spacing w:after="0" w:line="360" w:lineRule="auto"/>
-              <w:jc w:val="both"/>
               <w:rPr>
                 <w:rFonts w:ascii="Times New Roman" w:hAnsi="Times New Roman" w:cs="Times New Roman"/>
               </w:rPr>
@@ -11071,7 +11551,6 @@
           <w:p>
             <w:pPr>
               <w:spacing w:after="0" w:line="360" w:lineRule="auto"/>
-              <w:jc w:val="both"/>
               <w:rPr>
                 <w:rFonts w:ascii="Times New Roman" w:hAnsi="Times New Roman" w:cs="Times New Roman"/>
               </w:rPr>
@@ -11099,7 +11578,6 @@
           <w:p>
             <w:pPr>
               <w:spacing w:after="0" w:line="360" w:lineRule="auto"/>
-              <w:jc w:val="both"/>
               <w:rPr>
                 <w:rFonts w:ascii="Times New Roman" w:hAnsi="Times New Roman" w:cs="Times New Roman"/>
               </w:rPr>
@@ -11127,7 +11605,6 @@
           <w:p>
             <w:pPr>
               <w:spacing w:after="0" w:line="360" w:lineRule="auto"/>
-              <w:jc w:val="both"/>
               <w:rPr>
                 <w:rFonts w:ascii="Times New Roman" w:hAnsi="Times New Roman" w:cs="Times New Roman"/>
               </w:rPr>
@@ -11160,7 +11637,6 @@
           <w:p>
             <w:pPr>
               <w:spacing w:after="0" w:line="360" w:lineRule="auto"/>
-              <w:jc w:val="both"/>
               <w:rPr>
                 <w:rFonts w:ascii="Times New Roman" w:hAnsi="Times New Roman" w:cs="Times New Roman"/>
               </w:rPr>
@@ -11188,7 +11664,6 @@
           <w:p>
             <w:pPr>
               <w:spacing w:after="0" w:line="360" w:lineRule="auto"/>
-              <w:jc w:val="both"/>
               <w:rPr>
                 <w:rFonts w:ascii="Times New Roman" w:hAnsi="Times New Roman" w:cs="Times New Roman"/>
               </w:rPr>
@@ -11216,7 +11691,6 @@
           <w:p>
             <w:pPr>
               <w:spacing w:after="0" w:line="360" w:lineRule="auto"/>
-              <w:jc w:val="both"/>
               <w:rPr>
                 <w:rFonts w:ascii="Times New Roman" w:hAnsi="Times New Roman" w:cs="Times New Roman"/>
               </w:rPr>
@@ -11249,7 +11723,6 @@
           <w:p>
             <w:pPr>
               <w:spacing w:after="0" w:line="360" w:lineRule="auto"/>
-              <w:jc w:val="both"/>
               <w:rPr>
                 <w:rFonts w:ascii="Times New Roman" w:hAnsi="Times New Roman" w:cs="Times New Roman"/>
               </w:rPr>
@@ -11277,7 +11750,6 @@
           <w:p>
             <w:pPr>
               <w:spacing w:after="0" w:line="360" w:lineRule="auto"/>
-              <w:jc w:val="both"/>
               <w:rPr>
                 <w:rFonts w:ascii="Times New Roman" w:hAnsi="Times New Roman" w:cs="Times New Roman"/>
               </w:rPr>
@@ -11305,7 +11777,6 @@
           <w:p>
             <w:pPr>
               <w:spacing w:after="0" w:line="360" w:lineRule="auto"/>
-              <w:jc w:val="both"/>
               <w:rPr>
                 <w:rFonts w:ascii="Times New Roman" w:hAnsi="Times New Roman" w:cs="Times New Roman"/>
               </w:rPr>
@@ -11338,7 +11809,6 @@
           <w:p>
             <w:pPr>
               <w:spacing w:after="0" w:line="360" w:lineRule="auto"/>
-              <w:jc w:val="both"/>
               <w:rPr>
                 <w:rFonts w:ascii="Times New Roman" w:hAnsi="Times New Roman" w:cs="Times New Roman"/>
               </w:rPr>
@@ -11366,7 +11836,6 @@
           <w:p>
             <w:pPr>
               <w:spacing w:after="0" w:line="360" w:lineRule="auto"/>
-              <w:jc w:val="both"/>
               <w:rPr>
                 <w:rFonts w:ascii="Times New Roman" w:hAnsi="Times New Roman" w:cs="Times New Roman"/>
               </w:rPr>
@@ -11394,7 +11863,6 @@
           <w:p>
             <w:pPr>
               <w:spacing w:after="0" w:line="360" w:lineRule="auto"/>
-              <w:jc w:val="both"/>
               <w:rPr>
                 <w:rFonts w:ascii="Times New Roman" w:hAnsi="Times New Roman" w:cs="Times New Roman"/>
               </w:rPr>
@@ -11415,6 +11883,9 @@
         <w:tc>
           <w:tcPr>
             <w:tcW w:w="0" w:type="auto"/>
+            <w:tcBorders>
+              <w:bottom w:val="single" w:sz="4" w:space="0" w:color="auto"/>
+            </w:tcBorders>
             <w:tcMar>
               <w:top w:w="120" w:type="dxa"/>
               <w:left w:w="180" w:type="dxa"/>
@@ -11427,15 +11898,15 @@
           <w:p>
             <w:pPr>
               <w:spacing w:after="0" w:line="360" w:lineRule="auto"/>
-              <w:jc w:val="both"/>
-              <w:rPr>
-                <w:rFonts w:ascii="Times New Roman" w:hAnsi="Times New Roman" w:cs="Times New Roman"/>
-              </w:rPr>
-            </w:pPr>
-            <w:r>
-              <w:rPr>
-                <w:rFonts w:ascii="Times New Roman" w:hAnsi="Times New Roman" w:cs="Times New Roman"/>
-              </w:rPr>
+              <w:rPr>
+                <w:rFonts w:ascii="Times New Roman" w:hAnsi="Times New Roman" w:cs="Times New Roman"/>
+              </w:rPr>
+            </w:pPr>
+            <w:r>
+              <w:rPr>
+                <w:rFonts w:ascii="Times New Roman" w:hAnsi="Times New Roman" w:cs="Times New Roman"/>
+              </w:rPr>
+              <w:lastRenderedPageBreak/>
               <w:t>hardware_id</w:t>
             </w:r>
           </w:p>
@@ -11443,6 +11914,9 @@
         <w:tc>
           <w:tcPr>
             <w:tcW w:w="1572" w:type="dxa"/>
+            <w:tcBorders>
+              <w:bottom w:val="single" w:sz="4" w:space="0" w:color="auto"/>
+            </w:tcBorders>
             <w:tcMar>
               <w:top w:w="120" w:type="dxa"/>
               <w:left w:w="180" w:type="dxa"/>
@@ -11455,7 +11929,6 @@
           <w:p>
             <w:pPr>
               <w:spacing w:after="0" w:line="360" w:lineRule="auto"/>
-              <w:jc w:val="both"/>
               <w:rPr>
                 <w:rFonts w:ascii="Times New Roman" w:hAnsi="Times New Roman" w:cs="Times New Roman"/>
               </w:rPr>
@@ -11471,6 +11944,9 @@
         <w:tc>
           <w:tcPr>
             <w:tcW w:w="5519" w:type="dxa"/>
+            <w:tcBorders>
+              <w:bottom w:val="single" w:sz="4" w:space="0" w:color="auto"/>
+            </w:tcBorders>
             <w:tcMar>
               <w:top w:w="120" w:type="dxa"/>
               <w:left w:w="180" w:type="dxa"/>
@@ -11483,16 +11959,15 @@
           <w:p>
             <w:pPr>
               <w:spacing w:after="0" w:line="360" w:lineRule="auto"/>
-              <w:jc w:val="both"/>
-              <w:rPr>
-                <w:rFonts w:ascii="Times New Roman" w:hAnsi="Times New Roman" w:cs="Times New Roman"/>
-              </w:rPr>
-            </w:pPr>
-            <w:r>
-              <w:rPr>
-                <w:rFonts w:ascii="Times New Roman" w:hAnsi="Times New Roman" w:cs="Times New Roman"/>
-              </w:rPr>
-              <w:t>System identifier for the benchmark execution machine.</w:t>
+              <w:rPr>
+                <w:rFonts w:ascii="Times New Roman" w:hAnsi="Times New Roman" w:cs="Times New Roman"/>
+              </w:rPr>
+            </w:pPr>
+            <w:r>
+              <w:rPr>
+                <w:rFonts w:ascii="Times New Roman" w:hAnsi="Times New Roman" w:cs="Times New Roman"/>
+              </w:rPr>
+              <w:t>System identifier for the benchmark execution machine</w:t>
             </w:r>
           </w:p>
         </w:tc>
@@ -11506,6 +11981,12 @@
           <w:rFonts w:ascii="Times New Roman" w:hAnsi="Times New Roman" w:cs="Times New Roman"/>
         </w:rPr>
       </w:pPr>
+      <w:r>
+        <w:rPr>
+          <w:rFonts w:ascii="Times New Roman" w:hAnsi="Times New Roman" w:cs="Times New Roman"/>
+        </w:rPr>
+        <w:t>Source: field survey (2026)</w:t>
+      </w:r>
     </w:p>
     <w:p>
       <w:pPr>
@@ -11525,7 +12006,6 @@
           <w:b/>
           <w:szCs w:val="28"/>
         </w:rPr>
-        <w:lastRenderedPageBreak/>
         <w:t>3.10 Data Validation and Failure Classification</w:t>
       </w:r>
     </w:p>
@@ -11649,7 +12129,7 @@
         <w:rPr>
           <w:rFonts w:ascii="Times New Roman" w:hAnsi="Times New Roman" w:cs="Times New Roman"/>
         </w:rPr>
-        <w:t>Prior to applying inferential tests, dataset distributions are examined using histograms, box plots, Q-Q plots, skewness checks, and outlier analysis. This accounts for non-normal distributions caused by operating-system scheduling or resource contention during off-chain proving.</w:t>
+        <w:t>Prior to applying inferential tests, dataset distributions are examined using histograms, box plots, skewness checks, and outlier analysis. This accounts for non-normal distributions caused by operating-system scheduling or resource contention during off-chain proving.</w:t>
       </w:r>
       <w:r>
         <w:rPr>
@@ -15453,6 +15933,25 @@
     <w:semiHidden/>
     <w:rsid w:val="009840E5"/>
   </w:style>
+  <w:style w:type="paragraph" w:styleId="Caption">
+    <w:name w:val="caption"/>
+    <w:basedOn w:val="Normal"/>
+    <w:next w:val="Normal"/>
+    <w:uiPriority w:val="35"/>
+    <w:unhideWhenUsed/>
+    <w:qFormat/>
+    <w:rsid w:val="00F24060"/>
+    <w:pPr>
+      <w:spacing w:after="200" w:line="240" w:lineRule="auto"/>
+    </w:pPr>
+    <w:rPr>
+      <w:i/>
+      <w:iCs/>
+      <w:color w:val="0E2841" w:themeColor="text2"/>
+      <w:sz w:val="18"/>
+      <w:szCs w:val="18"/>
+    </w:rPr>
+  </w:style>
 </w:styles>
 </file>
 

</xml_diff>